<commit_message>
complete individual contribution statement
</commit_message>
<xml_diff>
--- a/Contribution/Individual Contribution Statement.docx
+++ b/Contribution/Individual Contribution Statement.docx
@@ -59,16 +59,16 @@
     </w:p>
     <w:tbl>
       <w:tblPr>
-        <w:tblStyle w:val="TableGrid"/>
+        <w:tblStyle w:val="ae"/>
         <w:tblW w:w="10060" w:type="dxa"/>
         <w:tblLook w:val="04A0" w:firstRow="1" w:lastRow="0" w:firstColumn="1" w:lastColumn="0" w:noHBand="0" w:noVBand="1"/>
       </w:tblPr>
       <w:tblGrid>
-        <w:gridCol w:w="1838"/>
-        <w:gridCol w:w="1606"/>
-        <w:gridCol w:w="1607"/>
-        <w:gridCol w:w="1607"/>
-        <w:gridCol w:w="3402"/>
+        <w:gridCol w:w="1891"/>
+        <w:gridCol w:w="1598"/>
+        <w:gridCol w:w="1597"/>
+        <w:gridCol w:w="1596"/>
+        <w:gridCol w:w="3378"/>
       </w:tblGrid>
       <w:tr>
         <w:trPr>
@@ -221,7 +221,7 @@
           </w:tcPr>
           <w:p>
             <w:pPr>
-              <w:pStyle w:val="ListParagraph"/>
+              <w:pStyle w:val="a9"/>
               <w:numPr>
                 <w:ilvl w:val="0"/>
                 <w:numId w:val="1"/>
@@ -230,12 +230,27 @@
                 <w:rFonts w:ascii="Times New Roman" w:hAnsi="Times New Roman" w:cs="Times New Roman"/>
               </w:rPr>
             </w:pPr>
+            <w:bookmarkStart w:id="0" w:name="_Hlk225615480"/>
+            <w:proofErr w:type="gramStart"/>
             <w:r>
               <w:rPr>
                 <w:rFonts w:ascii="Times New Roman" w:hAnsi="Times New Roman" w:cs="Times New Roman"/>
               </w:rPr>
               <w:t>DQR</w:t>
             </w:r>
+            <w:r>
+              <w:rPr>
+                <w:rFonts w:ascii="Times New Roman" w:hAnsi="Times New Roman" w:cs="Times New Roman" w:hint="eastAsia"/>
+              </w:rPr>
+              <w:t>(</w:t>
+            </w:r>
+            <w:proofErr w:type="gramEnd"/>
+            <w:r>
+              <w:rPr>
+                <w:rFonts w:ascii="Times New Roman" w:hAnsi="Times New Roman" w:cs="Times New Roman" w:hint="eastAsia"/>
+              </w:rPr>
+              <w:t>25/100)</w:t>
+            </w:r>
           </w:p>
         </w:tc>
         <w:tc>
@@ -250,6 +265,12 @@
                 <w:rFonts w:ascii="Times New Roman" w:hAnsi="Times New Roman" w:cs="Times New Roman"/>
               </w:rPr>
             </w:pPr>
+            <w:r>
+              <w:rPr>
+                <w:rFonts w:ascii="Times New Roman" w:hAnsi="Times New Roman" w:cs="Times New Roman" w:hint="eastAsia"/>
+              </w:rPr>
+              <w:t>40%</w:t>
+            </w:r>
           </w:p>
         </w:tc>
         <w:tc>
@@ -261,9 +282,15 @@
             <w:pPr>
               <w:jc w:val="center"/>
               <w:rPr>
-                <w:rFonts w:ascii="Times New Roman" w:hAnsi="Times New Roman" w:cs="Times New Roman"/>
-              </w:rPr>
-            </w:pPr>
+                <w:rFonts w:ascii="Times New Roman" w:hAnsi="Times New Roman" w:cs="Times New Roman" w:hint="eastAsia"/>
+              </w:rPr>
+            </w:pPr>
+            <w:r>
+              <w:rPr>
+                <w:rFonts w:ascii="Times New Roman" w:hAnsi="Times New Roman" w:cs="Times New Roman" w:hint="eastAsia"/>
+              </w:rPr>
+              <w:t>10%</w:t>
+            </w:r>
           </w:p>
         </w:tc>
         <w:tc>
@@ -280,9 +307,15 @@
             </w:pPr>
             <w:r>
               <w:rPr>
-                <w:rFonts w:ascii="Times New Roman" w:hAnsi="Times New Roman" w:cs="Times New Roman"/>
-              </w:rPr>
-              <w:t>30%</w:t>
+                <w:rFonts w:ascii="Times New Roman" w:hAnsi="Times New Roman" w:cs="Times New Roman" w:hint="eastAsia"/>
+              </w:rPr>
+              <w:t>5</w:t>
+            </w:r>
+            <w:r>
+              <w:rPr>
+                <w:rFonts w:ascii="Times New Roman" w:hAnsi="Times New Roman" w:cs="Times New Roman"/>
+              </w:rPr>
+              <w:t>0%</w:t>
             </w:r>
           </w:p>
         </w:tc>
@@ -294,7 +327,7 @@
           <w:p>
             <w:pPr>
               <w:rPr>
-                <w:rFonts w:ascii="Times New Roman" w:hAnsi="Times New Roman" w:cs="Times New Roman"/>
+                <w:rFonts w:ascii="Times New Roman" w:hAnsi="Times New Roman" w:cs="Times New Roman" w:hint="eastAsia"/>
               </w:rPr>
             </w:pPr>
             <w:proofErr w:type="spellStart"/>
@@ -302,20 +335,26 @@
               <w:rPr>
                 <w:rFonts w:ascii="Times New Roman" w:hAnsi="Times New Roman" w:cs="Times New Roman"/>
               </w:rPr>
-              <w:t>Haixiao</w:t>
+              <w:t>Haixiao:</w:t>
+            </w:r>
+            <w:r>
+              <w:rPr>
+                <w:rFonts w:ascii="Times New Roman" w:hAnsi="Times New Roman" w:cs="Times New Roman" w:hint="eastAsia"/>
+              </w:rPr>
+              <w:t>data</w:t>
             </w:r>
             <w:proofErr w:type="spellEnd"/>
             <w:r>
               <w:rPr>
-                <w:rFonts w:ascii="Times New Roman" w:hAnsi="Times New Roman" w:cs="Times New Roman"/>
-              </w:rPr>
-              <w:t>:</w:t>
-            </w:r>
-          </w:p>
-          <w:p>
-            <w:pPr>
-              <w:rPr>
-                <w:rFonts w:ascii="Times New Roman" w:hAnsi="Times New Roman" w:cs="Times New Roman"/>
+                <w:rFonts w:ascii="Times New Roman" w:hAnsi="Times New Roman" w:cs="Times New Roman" w:hint="eastAsia"/>
+              </w:rPr>
+              <w:t xml:space="preserve"> understanding code and markdowns</w:t>
+            </w:r>
+          </w:p>
+          <w:p>
+            <w:pPr>
+              <w:rPr>
+                <w:rFonts w:ascii="Times New Roman" w:hAnsi="Times New Roman" w:cs="Times New Roman" w:hint="eastAsia"/>
               </w:rPr>
             </w:pPr>
             <w:r>
@@ -351,7 +390,7 @@
           </w:tcPr>
           <w:p>
             <w:pPr>
-              <w:pStyle w:val="ListParagraph"/>
+              <w:pStyle w:val="a9"/>
               <w:numPr>
                 <w:ilvl w:val="0"/>
                 <w:numId w:val="1"/>
@@ -360,12 +399,26 @@
                 <w:rFonts w:ascii="Times New Roman" w:hAnsi="Times New Roman" w:cs="Times New Roman"/>
               </w:rPr>
             </w:pPr>
+            <w:proofErr w:type="gramStart"/>
             <w:r>
               <w:rPr>
                 <w:rFonts w:ascii="Times New Roman" w:hAnsi="Times New Roman" w:cs="Times New Roman"/>
               </w:rPr>
               <w:t>DQP</w:t>
             </w:r>
+            <w:r>
+              <w:rPr>
+                <w:rFonts w:ascii="Times New Roman" w:hAnsi="Times New Roman" w:cs="Times New Roman" w:hint="eastAsia"/>
+              </w:rPr>
+              <w:t>(</w:t>
+            </w:r>
+            <w:proofErr w:type="gramEnd"/>
+            <w:r>
+              <w:rPr>
+                <w:rFonts w:ascii="Times New Roman" w:hAnsi="Times New Roman" w:cs="Times New Roman" w:hint="eastAsia"/>
+              </w:rPr>
+              <w:t>15/100)</w:t>
+            </w:r>
           </w:p>
         </w:tc>
         <w:tc>
@@ -377,9 +430,15 @@
             <w:pPr>
               <w:jc w:val="center"/>
               <w:rPr>
-                <w:rFonts w:ascii="Times New Roman" w:hAnsi="Times New Roman" w:cs="Times New Roman"/>
-              </w:rPr>
-            </w:pPr>
+                <w:rFonts w:ascii="Times New Roman" w:hAnsi="Times New Roman" w:cs="Times New Roman" w:hint="eastAsia"/>
+              </w:rPr>
+            </w:pPr>
+            <w:r>
+              <w:rPr>
+                <w:rFonts w:ascii="Times New Roman" w:hAnsi="Times New Roman" w:cs="Times New Roman" w:hint="eastAsia"/>
+              </w:rPr>
+              <w:t>10%</w:t>
+            </w:r>
           </w:p>
         </w:tc>
         <w:tc>
@@ -394,6 +453,12 @@
                 <w:rFonts w:ascii="Times New Roman" w:hAnsi="Times New Roman" w:cs="Times New Roman"/>
               </w:rPr>
             </w:pPr>
+            <w:r>
+              <w:rPr>
+                <w:rFonts w:ascii="Times New Roman" w:hAnsi="Times New Roman" w:cs="Times New Roman" w:hint="eastAsia"/>
+              </w:rPr>
+              <w:t>40%</w:t>
+            </w:r>
           </w:p>
         </w:tc>
         <w:tc>
@@ -410,9 +475,15 @@
             </w:pPr>
             <w:r>
               <w:rPr>
-                <w:rFonts w:ascii="Times New Roman" w:hAnsi="Times New Roman" w:cs="Times New Roman"/>
-              </w:rPr>
-              <w:t>30%</w:t>
+                <w:rFonts w:ascii="Times New Roman" w:hAnsi="Times New Roman" w:cs="Times New Roman" w:hint="eastAsia"/>
+              </w:rPr>
+              <w:t>5</w:t>
+            </w:r>
+            <w:r>
+              <w:rPr>
+                <w:rFonts w:ascii="Times New Roman" w:hAnsi="Times New Roman" w:cs="Times New Roman"/>
+              </w:rPr>
+              <w:t>0%</w:t>
             </w:r>
           </w:p>
         </w:tc>
@@ -441,6 +512,20 @@
               </w:rPr>
               <w:t>:</w:t>
             </w:r>
+            <w:bookmarkStart w:id="1" w:name="OLE_LINK3"/>
+            <w:r>
+              <w:rPr>
+                <w:rFonts w:ascii="Times New Roman" w:hAnsi="Times New Roman" w:cs="Times New Roman" w:hint="eastAsia"/>
+              </w:rPr>
+              <w:t xml:space="preserve"> </w:t>
+            </w:r>
+            <w:r>
+              <w:rPr>
+                <w:rFonts w:ascii="Times New Roman" w:hAnsi="Times New Roman" w:cs="Times New Roman" w:hint="eastAsia"/>
+              </w:rPr>
+              <w:t>group discussion</w:t>
+            </w:r>
+            <w:bookmarkEnd w:id="1"/>
           </w:p>
           <w:p>
             <w:pPr>
@@ -481,7 +566,7 @@
           </w:tcPr>
           <w:p>
             <w:pPr>
-              <w:pStyle w:val="ListParagraph"/>
+              <w:pStyle w:val="a9"/>
               <w:numPr>
                 <w:ilvl w:val="0"/>
                 <w:numId w:val="1"/>
@@ -496,6 +581,18 @@
               </w:rPr>
               <w:t>Feature pairs</w:t>
             </w:r>
+            <w:r>
+              <w:rPr>
+                <w:rFonts w:ascii="Times New Roman" w:hAnsi="Times New Roman" w:cs="Times New Roman"/>
+              </w:rPr>
+              <w:br/>
+            </w:r>
+            <w:r>
+              <w:rPr>
+                <w:rFonts w:ascii="Times New Roman" w:hAnsi="Times New Roman" w:cs="Times New Roman" w:hint="eastAsia"/>
+              </w:rPr>
+              <w:t>(15/100)</w:t>
+            </w:r>
           </w:p>
         </w:tc>
         <w:tc>
@@ -507,9 +604,15 @@
             <w:pPr>
               <w:jc w:val="center"/>
               <w:rPr>
-                <w:rFonts w:ascii="Times New Roman" w:hAnsi="Times New Roman" w:cs="Times New Roman"/>
-              </w:rPr>
-            </w:pPr>
+                <w:rFonts w:ascii="Times New Roman" w:hAnsi="Times New Roman" w:cs="Times New Roman" w:hint="eastAsia"/>
+              </w:rPr>
+            </w:pPr>
+            <w:r>
+              <w:rPr>
+                <w:rFonts w:ascii="Times New Roman" w:hAnsi="Times New Roman" w:cs="Times New Roman" w:hint="eastAsia"/>
+              </w:rPr>
+              <w:t>80%</w:t>
+            </w:r>
           </w:p>
         </w:tc>
         <w:tc>
@@ -521,9 +624,15 @@
             <w:pPr>
               <w:jc w:val="center"/>
               <w:rPr>
-                <w:rFonts w:ascii="Times New Roman" w:hAnsi="Times New Roman" w:cs="Times New Roman"/>
-              </w:rPr>
-            </w:pPr>
+                <w:rFonts w:ascii="Times New Roman" w:hAnsi="Times New Roman" w:cs="Times New Roman" w:hint="eastAsia"/>
+              </w:rPr>
+            </w:pPr>
+            <w:r>
+              <w:rPr>
+                <w:rFonts w:ascii="Times New Roman" w:hAnsi="Times New Roman" w:cs="Times New Roman" w:hint="eastAsia"/>
+              </w:rPr>
+              <w:t>10%</w:t>
+            </w:r>
           </w:p>
         </w:tc>
         <w:tc>
@@ -535,9 +644,15 @@
             <w:pPr>
               <w:jc w:val="center"/>
               <w:rPr>
-                <w:rFonts w:ascii="Times New Roman" w:hAnsi="Times New Roman" w:cs="Times New Roman"/>
-              </w:rPr>
-            </w:pPr>
+                <w:rFonts w:ascii="Times New Roman" w:hAnsi="Times New Roman" w:cs="Times New Roman" w:hint="eastAsia"/>
+              </w:rPr>
+            </w:pPr>
+            <w:r>
+              <w:rPr>
+                <w:rFonts w:ascii="Times New Roman" w:hAnsi="Times New Roman" w:cs="Times New Roman" w:hint="eastAsia"/>
+              </w:rPr>
+              <w:t>10%</w:t>
+            </w:r>
           </w:p>
         </w:tc>
         <w:tc>
@@ -548,7 +663,7 @@
           <w:p>
             <w:pPr>
               <w:rPr>
-                <w:rFonts w:ascii="Times New Roman" w:hAnsi="Times New Roman" w:cs="Times New Roman"/>
+                <w:rFonts w:ascii="Times New Roman" w:hAnsi="Times New Roman" w:cs="Times New Roman" w:hint="eastAsia"/>
               </w:rPr>
             </w:pPr>
             <w:proofErr w:type="spellStart"/>
@@ -564,6 +679,12 @@
                 <w:rFonts w:ascii="Times New Roman" w:hAnsi="Times New Roman" w:cs="Times New Roman"/>
               </w:rPr>
               <w:t>:</w:t>
+            </w:r>
+            <w:r>
+              <w:rPr>
+                <w:rFonts w:ascii="Times New Roman" w:hAnsi="Times New Roman" w:cs="Times New Roman" w:hint="eastAsia"/>
+              </w:rPr>
+              <w:t xml:space="preserve"> feature pairs code and markdowns</w:t>
             </w:r>
           </w:p>
           <w:p>
@@ -605,7 +726,7 @@
           </w:tcPr>
           <w:p>
             <w:pPr>
-              <w:pStyle w:val="ListParagraph"/>
+              <w:pStyle w:val="a9"/>
               <w:numPr>
                 <w:ilvl w:val="0"/>
                 <w:numId w:val="1"/>
@@ -620,6 +741,18 @@
               </w:rPr>
               <w:t>New features</w:t>
             </w:r>
+            <w:r>
+              <w:rPr>
+                <w:rFonts w:ascii="Times New Roman" w:hAnsi="Times New Roman" w:cs="Times New Roman"/>
+              </w:rPr>
+              <w:br/>
+            </w:r>
+            <w:r>
+              <w:rPr>
+                <w:rFonts w:ascii="Times New Roman" w:hAnsi="Times New Roman" w:cs="Times New Roman" w:hint="eastAsia"/>
+              </w:rPr>
+              <w:t>(15/100)</w:t>
+            </w:r>
           </w:p>
         </w:tc>
         <w:tc>
@@ -631,9 +764,15 @@
             <w:pPr>
               <w:jc w:val="center"/>
               <w:rPr>
-                <w:rFonts w:ascii="Times New Roman" w:hAnsi="Times New Roman" w:cs="Times New Roman"/>
-              </w:rPr>
-            </w:pPr>
+                <w:rFonts w:ascii="Times New Roman" w:hAnsi="Times New Roman" w:cs="Times New Roman" w:hint="eastAsia"/>
+              </w:rPr>
+            </w:pPr>
+            <w:r>
+              <w:rPr>
+                <w:rFonts w:ascii="Times New Roman" w:hAnsi="Times New Roman" w:cs="Times New Roman" w:hint="eastAsia"/>
+              </w:rPr>
+              <w:t>10%</w:t>
+            </w:r>
           </w:p>
         </w:tc>
         <w:tc>
@@ -645,9 +784,15 @@
             <w:pPr>
               <w:jc w:val="center"/>
               <w:rPr>
-                <w:rFonts w:ascii="Times New Roman" w:hAnsi="Times New Roman" w:cs="Times New Roman"/>
-              </w:rPr>
-            </w:pPr>
+                <w:rFonts w:ascii="Times New Roman" w:hAnsi="Times New Roman" w:cs="Times New Roman" w:hint="eastAsia"/>
+              </w:rPr>
+            </w:pPr>
+            <w:r>
+              <w:rPr>
+                <w:rFonts w:ascii="Times New Roman" w:hAnsi="Times New Roman" w:cs="Times New Roman" w:hint="eastAsia"/>
+              </w:rPr>
+              <w:t>80%</w:t>
+            </w:r>
           </w:p>
         </w:tc>
         <w:tc>
@@ -659,9 +804,15 @@
             <w:pPr>
               <w:jc w:val="center"/>
               <w:rPr>
-                <w:rFonts w:ascii="Times New Roman" w:hAnsi="Times New Roman" w:cs="Times New Roman"/>
-              </w:rPr>
-            </w:pPr>
+                <w:rFonts w:ascii="Times New Roman" w:hAnsi="Times New Roman" w:cs="Times New Roman" w:hint="eastAsia"/>
+              </w:rPr>
+            </w:pPr>
+            <w:r>
+              <w:rPr>
+                <w:rFonts w:ascii="Times New Roman" w:hAnsi="Times New Roman" w:cs="Times New Roman" w:hint="eastAsia"/>
+              </w:rPr>
+              <w:t>10%</w:t>
+            </w:r>
           </w:p>
         </w:tc>
         <w:tc>
@@ -688,6 +839,18 @@
                 <w:rFonts w:ascii="Times New Roman" w:hAnsi="Times New Roman" w:cs="Times New Roman"/>
               </w:rPr>
               <w:t>:</w:t>
+            </w:r>
+            <w:r>
+              <w:rPr>
+                <w:rFonts w:ascii="Times New Roman" w:hAnsi="Times New Roman" w:cs="Times New Roman" w:hint="eastAsia"/>
+              </w:rPr>
+              <w:t xml:space="preserve"> </w:t>
+            </w:r>
+            <w:r>
+              <w:rPr>
+                <w:rFonts w:ascii="Times New Roman" w:hAnsi="Times New Roman" w:cs="Times New Roman" w:hint="eastAsia"/>
+              </w:rPr>
+              <w:t>group discussion</w:t>
             </w:r>
           </w:p>
           <w:p>
@@ -729,7 +892,7 @@
           </w:tcPr>
           <w:p>
             <w:pPr>
-              <w:pStyle w:val="ListParagraph"/>
+              <w:pStyle w:val="a9"/>
               <w:numPr>
                 <w:ilvl w:val="0"/>
                 <w:numId w:val="1"/>
@@ -744,6 +907,18 @@
               </w:rPr>
               <w:t>Models</w:t>
             </w:r>
+            <w:r>
+              <w:rPr>
+                <w:rFonts w:ascii="Times New Roman" w:hAnsi="Times New Roman" w:cs="Times New Roman"/>
+              </w:rPr>
+              <w:br/>
+            </w:r>
+            <w:r>
+              <w:rPr>
+                <w:rFonts w:ascii="Times New Roman" w:hAnsi="Times New Roman" w:cs="Times New Roman" w:hint="eastAsia"/>
+              </w:rPr>
+              <w:t>(30/100)</w:t>
+            </w:r>
           </w:p>
         </w:tc>
         <w:tc>
@@ -758,6 +933,12 @@
                 <w:rFonts w:ascii="Times New Roman" w:hAnsi="Times New Roman" w:cs="Times New Roman"/>
               </w:rPr>
             </w:pPr>
+            <w:r>
+              <w:rPr>
+                <w:rFonts w:ascii="Times New Roman" w:hAnsi="Times New Roman" w:cs="Times New Roman" w:hint="eastAsia"/>
+              </w:rPr>
+              <w:t>35%</w:t>
+            </w:r>
           </w:p>
         </w:tc>
         <w:tc>
@@ -769,9 +950,15 @@
             <w:pPr>
               <w:jc w:val="center"/>
               <w:rPr>
-                <w:rFonts w:ascii="Times New Roman" w:hAnsi="Times New Roman" w:cs="Times New Roman"/>
-              </w:rPr>
-            </w:pPr>
+                <w:rFonts w:ascii="Times New Roman" w:hAnsi="Times New Roman" w:cs="Times New Roman" w:hint="eastAsia"/>
+              </w:rPr>
+            </w:pPr>
+            <w:r>
+              <w:rPr>
+                <w:rFonts w:ascii="Times New Roman" w:hAnsi="Times New Roman" w:cs="Times New Roman" w:hint="eastAsia"/>
+              </w:rPr>
+              <w:t>35%</w:t>
+            </w:r>
           </w:p>
         </w:tc>
         <w:tc>
@@ -802,7 +989,7 @@
           <w:p>
             <w:pPr>
               <w:rPr>
-                <w:rFonts w:ascii="Times New Roman" w:hAnsi="Times New Roman" w:cs="Times New Roman"/>
+                <w:rFonts w:ascii="Times New Roman" w:hAnsi="Times New Roman" w:cs="Times New Roman" w:hint="eastAsia"/>
               </w:rPr>
             </w:pPr>
             <w:proofErr w:type="spellStart"/>
@@ -819,6 +1006,40 @@
               </w:rPr>
               <w:t>:</w:t>
             </w:r>
+            <w:r>
+              <w:rPr>
+                <w:rFonts w:ascii="Times New Roman" w:hAnsi="Times New Roman" w:cs="Times New Roman" w:hint="eastAsia"/>
+              </w:rPr>
+              <w:t xml:space="preserve"> train-validation date </w:t>
+            </w:r>
+            <w:proofErr w:type="gramStart"/>
+            <w:r>
+              <w:rPr>
+                <w:rFonts w:ascii="Times New Roman" w:hAnsi="Times New Roman" w:cs="Times New Roman" w:hint="eastAsia"/>
+              </w:rPr>
+              <w:t>split ,</w:t>
+            </w:r>
+            <w:proofErr w:type="gramEnd"/>
+            <w:r>
+              <w:rPr>
+                <w:rFonts w:ascii="Times New Roman" w:hAnsi="Times New Roman" w:cs="Times New Roman" w:hint="eastAsia"/>
+              </w:rPr>
+              <w:t xml:space="preserve"> </w:t>
+            </w:r>
+            <w:proofErr w:type="spellStart"/>
+            <w:r>
+              <w:rPr>
+                <w:rFonts w:ascii="Times New Roman" w:hAnsi="Times New Roman" w:cs="Times New Roman" w:hint="eastAsia"/>
+              </w:rPr>
+              <w:t>RidgeCV</w:t>
+            </w:r>
+            <w:proofErr w:type="spellEnd"/>
+            <w:r>
+              <w:rPr>
+                <w:rFonts w:ascii="Times New Roman" w:hAnsi="Times New Roman" w:cs="Times New Roman" w:hint="eastAsia"/>
+              </w:rPr>
+              <w:t xml:space="preserve"> and test data processing.</w:t>
+            </w:r>
           </w:p>
           <w:p>
             <w:pPr>
@@ -843,17 +1064,12 @@
               <w:rPr>
                 <w:rFonts w:ascii="Times New Roman" w:hAnsi="Times New Roman" w:cs="Times New Roman"/>
               </w:rPr>
-              <w:t>Yian:</w:t>
-            </w:r>
-            <w:r>
-              <w:rPr>
-                <w:rFonts w:ascii="Times New Roman" w:hAnsi="Times New Roman" w:cs="Times New Roman"/>
-              </w:rPr>
-              <w:t xml:space="preserve"> Linear regression, Lasso</w:t>
+              <w:t>Yian: Linear regression, Lasso</w:t>
             </w:r>
           </w:p>
         </w:tc>
       </w:tr>
+      <w:bookmarkEnd w:id="0"/>
       <w:tr>
         <w:trPr>
           <w:trHeight w:val="641"/>
@@ -890,27 +1106,19 @@
             <w:pPr>
               <w:jc w:val="center"/>
               <w:rPr>
-                <w:rFonts w:ascii="Times New Roman" w:hAnsi="Times New Roman" w:cs="Times New Roman"/>
+                <w:rFonts w:ascii="Times New Roman" w:hAnsi="Times New Roman" w:cs="Times New Roman" w:hint="eastAsia"/>
                 <w:b/>
                 <w:bCs/>
               </w:rPr>
             </w:pPr>
-          </w:p>
-        </w:tc>
-        <w:tc>
-          <w:tcPr>
-            <w:tcW w:w="1607" w:type="dxa"/>
-            <w:vAlign w:val="center"/>
-          </w:tcPr>
-          <w:p>
-            <w:pPr>
-              <w:jc w:val="center"/>
-              <w:rPr>
-                <w:rFonts w:ascii="Times New Roman" w:hAnsi="Times New Roman" w:cs="Times New Roman"/>
+            <w:r>
+              <w:rPr>
+                <w:rFonts w:ascii="Times New Roman" w:hAnsi="Times New Roman" w:cs="Times New Roman" w:hint="eastAsia"/>
                 <w:b/>
                 <w:bCs/>
               </w:rPr>
-            </w:pPr>
+              <w:t>35.5%</w:t>
+            </w:r>
           </w:p>
         </w:tc>
         <w:tc>
@@ -922,11 +1130,43 @@
             <w:pPr>
               <w:jc w:val="center"/>
               <w:rPr>
-                <w:rFonts w:ascii="Times New Roman" w:hAnsi="Times New Roman" w:cs="Times New Roman"/>
+                <w:rFonts w:ascii="Times New Roman" w:hAnsi="Times New Roman" w:cs="Times New Roman" w:hint="eastAsia"/>
                 <w:b/>
                 <w:bCs/>
               </w:rPr>
             </w:pPr>
+            <w:r>
+              <w:rPr>
+                <w:rFonts w:ascii="Times New Roman" w:hAnsi="Times New Roman" w:cs="Times New Roman" w:hint="eastAsia"/>
+                <w:b/>
+                <w:bCs/>
+              </w:rPr>
+              <w:t>32.5%</w:t>
+            </w:r>
+          </w:p>
+        </w:tc>
+        <w:tc>
+          <w:tcPr>
+            <w:tcW w:w="1607" w:type="dxa"/>
+            <w:vAlign w:val="center"/>
+          </w:tcPr>
+          <w:p>
+            <w:pPr>
+              <w:jc w:val="center"/>
+              <w:rPr>
+                <w:rFonts w:ascii="Times New Roman" w:hAnsi="Times New Roman" w:cs="Times New Roman" w:hint="eastAsia"/>
+                <w:b/>
+                <w:bCs/>
+              </w:rPr>
+            </w:pPr>
+            <w:r>
+              <w:rPr>
+                <w:rFonts w:ascii="Times New Roman" w:hAnsi="Times New Roman" w:cs="Times New Roman" w:hint="eastAsia"/>
+                <w:b/>
+                <w:bCs/>
+              </w:rPr>
+              <w:t>32%</w:t>
+            </w:r>
           </w:p>
         </w:tc>
         <w:tc>
@@ -1017,7 +1257,7 @@
     </w:p>
     <w:tbl>
       <w:tblPr>
-        <w:tblStyle w:val="TableGrid"/>
+        <w:tblStyle w:val="ae"/>
         <w:tblW w:w="10049" w:type="dxa"/>
         <w:tblLook w:val="04A0" w:firstRow="1" w:lastRow="0" w:firstColumn="1" w:lastColumn="0" w:noHBand="0" w:noVBand="1"/>
       </w:tblPr>
@@ -1039,7 +1279,7 @@
           <w:p>
             <w:pPr>
               <w:rPr>
-                <w:rFonts w:ascii="Times New Roman" w:hAnsi="Times New Roman" w:cs="Times New Roman" w:hint="eastAsia"/>
+                <w:rFonts w:ascii="Times New Roman" w:hAnsi="Times New Roman" w:cs="Times New Roman"/>
                 <w:b/>
                 <w:bCs/>
                 <w:lang w:val="en-US"/>
@@ -1091,7 +1331,7 @@
             <w:pPr>
               <w:jc w:val="center"/>
               <w:rPr>
-                <w:rFonts w:ascii="Times New Roman" w:hAnsi="Times New Roman" w:cs="Times New Roman" w:hint="eastAsia"/>
+                <w:rFonts w:ascii="Times New Roman" w:hAnsi="Times New Roman" w:cs="Times New Roman"/>
                 <w:b/>
                 <w:bCs/>
                 <w:lang w:val="en-US"/>
@@ -1118,7 +1358,7 @@
             <w:pPr>
               <w:jc w:val="center"/>
               <w:rPr>
-                <w:rFonts w:ascii="Times New Roman" w:hAnsi="Times New Roman" w:cs="Times New Roman" w:hint="eastAsia"/>
+                <w:rFonts w:ascii="Times New Roman" w:hAnsi="Times New Roman" w:cs="Times New Roman"/>
                 <w:b/>
                 <w:bCs/>
                 <w:lang w:val="en-US"/>
@@ -1145,7 +1385,7 @@
             <w:pPr>
               <w:jc w:val="center"/>
               <w:rPr>
-                <w:rFonts w:ascii="Times New Roman" w:hAnsi="Times New Roman" w:cs="Times New Roman" w:hint="eastAsia"/>
+                <w:rFonts w:ascii="Times New Roman" w:hAnsi="Times New Roman" w:cs="Times New Roman"/>
                 <w:b/>
                 <w:bCs/>
                 <w:lang w:val="en-US"/>
@@ -1183,7 +1423,7 @@
           </w:tcPr>
           <w:p>
             <w:pPr>
-              <w:pStyle w:val="ListParagraph"/>
+              <w:pStyle w:val="a9"/>
               <w:numPr>
                 <w:ilvl w:val="0"/>
                 <w:numId w:val="2"/>
@@ -1208,10 +1448,34 @@
           <w:p>
             <w:pPr>
               <w:rPr>
-                <w:rFonts w:ascii="Times New Roman" w:hAnsi="Times New Roman" w:cs="Times New Roman" w:hint="eastAsia"/>
-                <w:lang w:val="en-US"/>
-              </w:rPr>
-            </w:pPr>
+                <w:rFonts w:ascii="Times New Roman" w:hAnsi="Times New Roman" w:cs="Times New Roman"/>
+                <w:lang w:val="en-US"/>
+              </w:rPr>
+            </w:pPr>
+            <w:r>
+              <w:rPr>
+                <w:rFonts w:ascii="Times New Roman" w:hAnsi="Times New Roman" w:cs="Times New Roman"/>
+              </w:rPr>
+              <w:t>I</w:t>
+            </w:r>
+            <w:r>
+              <w:rPr>
+                <w:rFonts w:ascii="Times New Roman" w:hAnsi="Times New Roman" w:cs="Times New Roman" w:hint="eastAsia"/>
+              </w:rPr>
+              <w:t xml:space="preserve">mplement </w:t>
+            </w:r>
+            <w:r>
+              <w:rPr>
+                <w:rFonts w:ascii="Times New Roman" w:hAnsi="Times New Roman" w:cs="Times New Roman" w:hint="eastAsia"/>
+              </w:rPr>
+              <w:t xml:space="preserve">data understanding code and </w:t>
+            </w:r>
+            <w:r>
+              <w:rPr>
+                <w:rFonts w:ascii="Times New Roman" w:hAnsi="Times New Roman" w:cs="Times New Roman"/>
+              </w:rPr>
+              <w:t>explanation</w:t>
+            </w:r>
           </w:p>
         </w:tc>
         <w:tc>
@@ -1227,6 +1491,13 @@
                 <w:lang w:val="en-US"/>
               </w:rPr>
             </w:pPr>
+            <w:r>
+              <w:rPr>
+                <w:rFonts w:ascii="Times New Roman" w:hAnsi="Times New Roman" w:cs="Times New Roman" w:hint="eastAsia"/>
+                <w:lang w:val="en-US"/>
+              </w:rPr>
+              <w:t>3</w:t>
+            </w:r>
           </w:p>
         </w:tc>
       </w:tr>
@@ -1241,7 +1512,7 @@
           </w:tcPr>
           <w:p>
             <w:pPr>
-              <w:pStyle w:val="ListParagraph"/>
+              <w:pStyle w:val="a9"/>
               <w:numPr>
                 <w:ilvl w:val="0"/>
                 <w:numId w:val="2"/>
@@ -1270,6 +1541,22 @@
                 <w:lang w:val="en-US"/>
               </w:rPr>
             </w:pPr>
+            <w:bookmarkStart w:id="2" w:name="OLE_LINK7"/>
+            <w:r>
+              <w:rPr>
+                <w:rFonts w:ascii="Times New Roman" w:hAnsi="Times New Roman" w:cs="Times New Roman" w:hint="eastAsia"/>
+                <w:lang w:val="en-US"/>
+              </w:rPr>
+              <w:t>Discuss with group members about</w:t>
+            </w:r>
+            <w:bookmarkEnd w:id="2"/>
+            <w:r>
+              <w:rPr>
+                <w:rFonts w:ascii="Times New Roman" w:hAnsi="Times New Roman" w:cs="Times New Roman" w:hint="eastAsia"/>
+                <w:lang w:val="en-US"/>
+              </w:rPr>
+              <w:t xml:space="preserve"> the strategy for DQP</w:t>
+            </w:r>
           </w:p>
         </w:tc>
         <w:tc>
@@ -1285,6 +1572,13 @@
                 <w:lang w:val="en-US"/>
               </w:rPr>
             </w:pPr>
+            <w:r>
+              <w:rPr>
+                <w:rFonts w:ascii="Times New Roman" w:hAnsi="Times New Roman" w:cs="Times New Roman" w:hint="eastAsia"/>
+                <w:lang w:val="en-US"/>
+              </w:rPr>
+              <w:t>0.5</w:t>
+            </w:r>
           </w:p>
         </w:tc>
       </w:tr>
@@ -1299,7 +1593,7 @@
           </w:tcPr>
           <w:p>
             <w:pPr>
-              <w:pStyle w:val="ListParagraph"/>
+              <w:pStyle w:val="a9"/>
               <w:numPr>
                 <w:ilvl w:val="0"/>
                 <w:numId w:val="2"/>
@@ -1324,10 +1618,42 @@
           <w:p>
             <w:pPr>
               <w:rPr>
-                <w:rFonts w:ascii="Times New Roman" w:hAnsi="Times New Roman" w:cs="Times New Roman" w:hint="eastAsia"/>
-                <w:lang w:val="en-US"/>
-              </w:rPr>
-            </w:pPr>
+                <w:rFonts w:ascii="Times New Roman" w:hAnsi="Times New Roman" w:cs="Times New Roman"/>
+                <w:lang w:val="en-US"/>
+              </w:rPr>
+            </w:pPr>
+            <w:r>
+              <w:rPr>
+                <w:rFonts w:ascii="Times New Roman" w:hAnsi="Times New Roman" w:cs="Times New Roman"/>
+              </w:rPr>
+              <w:t>I</w:t>
+            </w:r>
+            <w:r>
+              <w:rPr>
+                <w:rFonts w:ascii="Times New Roman" w:hAnsi="Times New Roman" w:cs="Times New Roman" w:hint="eastAsia"/>
+              </w:rPr>
+              <w:t>mplement feature pair</w:t>
+            </w:r>
+            <w:r>
+              <w:rPr>
+                <w:rFonts w:ascii="Times New Roman" w:hAnsi="Times New Roman" w:cs="Times New Roman" w:hint="eastAsia"/>
+              </w:rPr>
+              <w:t>ing</w:t>
+            </w:r>
+            <w:r>
+              <w:rPr>
+                <w:rFonts w:ascii="Times New Roman" w:hAnsi="Times New Roman" w:cs="Times New Roman" w:hint="eastAsia"/>
+              </w:rPr>
+              <w:t xml:space="preserve"> code and </w:t>
+            </w:r>
+            <w:bookmarkStart w:id="3" w:name="OLE_LINK5"/>
+            <w:r>
+              <w:rPr>
+                <w:rFonts w:ascii="Times New Roman" w:hAnsi="Times New Roman" w:cs="Times New Roman"/>
+              </w:rPr>
+              <w:t>explanation</w:t>
+            </w:r>
+            <w:bookmarkEnd w:id="3"/>
           </w:p>
         </w:tc>
         <w:tc>
@@ -1339,10 +1665,17 @@
             <w:pPr>
               <w:jc w:val="center"/>
               <w:rPr>
-                <w:rFonts w:ascii="Times New Roman" w:hAnsi="Times New Roman" w:cs="Times New Roman" w:hint="eastAsia"/>
-                <w:lang w:val="en-US"/>
-              </w:rPr>
-            </w:pPr>
+                <w:rFonts w:ascii="Times New Roman" w:hAnsi="Times New Roman" w:cs="Times New Roman"/>
+                <w:lang w:val="en-US"/>
+              </w:rPr>
+            </w:pPr>
+            <w:r>
+              <w:rPr>
+                <w:rFonts w:ascii="Times New Roman" w:hAnsi="Times New Roman" w:cs="Times New Roman" w:hint="eastAsia"/>
+                <w:lang w:val="en-US"/>
+              </w:rPr>
+              <w:t>3</w:t>
+            </w:r>
           </w:p>
         </w:tc>
       </w:tr>
@@ -1357,7 +1690,7 @@
           </w:tcPr>
           <w:p>
             <w:pPr>
-              <w:pStyle w:val="ListParagraph"/>
+              <w:pStyle w:val="a9"/>
               <w:numPr>
                 <w:ilvl w:val="0"/>
                 <w:numId w:val="2"/>
@@ -1382,10 +1715,17 @@
           <w:p>
             <w:pPr>
               <w:rPr>
-                <w:rFonts w:ascii="Times New Roman" w:hAnsi="Times New Roman" w:cs="Times New Roman" w:hint="eastAsia"/>
-                <w:lang w:val="en-US"/>
-              </w:rPr>
-            </w:pPr>
+                <w:rFonts w:ascii="Times New Roman" w:hAnsi="Times New Roman" w:cs="Times New Roman"/>
+                <w:lang w:val="en-US"/>
+              </w:rPr>
+            </w:pPr>
+            <w:r>
+              <w:rPr>
+                <w:rFonts w:ascii="Times New Roman" w:hAnsi="Times New Roman" w:cs="Times New Roman" w:hint="eastAsia"/>
+                <w:lang w:val="en-US"/>
+              </w:rPr>
+              <w:t>Discuss with group members about DQP</w:t>
+            </w:r>
           </w:p>
         </w:tc>
         <w:tc>
@@ -1401,6 +1741,13 @@
                 <w:lang w:val="en-US"/>
               </w:rPr>
             </w:pPr>
+            <w:r>
+              <w:rPr>
+                <w:rFonts w:ascii="Times New Roman" w:hAnsi="Times New Roman" w:cs="Times New Roman" w:hint="eastAsia"/>
+                <w:lang w:val="en-US"/>
+              </w:rPr>
+              <w:t>0.5</w:t>
+            </w:r>
           </w:p>
         </w:tc>
       </w:tr>
@@ -1411,11 +1758,12 @@
         <w:tc>
           <w:tcPr>
             <w:tcW w:w="2122" w:type="dxa"/>
-            <w:vAlign w:val="center"/>
-          </w:tcPr>
-          <w:p>
-            <w:pPr>
-              <w:pStyle w:val="ListParagraph"/>
+            <w:vMerge w:val="restart"/>
+            <w:vAlign w:val="center"/>
+          </w:tcPr>
+          <w:p>
+            <w:pPr>
+              <w:pStyle w:val="a9"/>
               <w:numPr>
                 <w:ilvl w:val="0"/>
                 <w:numId w:val="2"/>
@@ -1444,6 +1792,20 @@
                 <w:lang w:val="en-US"/>
               </w:rPr>
             </w:pPr>
+            <w:r>
+              <w:rPr>
+                <w:rFonts w:ascii="Times New Roman" w:hAnsi="Times New Roman" w:cs="Times New Roman"/>
+                <w:lang w:val="en-US"/>
+              </w:rPr>
+              <w:t>I</w:t>
+            </w:r>
+            <w:r>
+              <w:rPr>
+                <w:rFonts w:ascii="Times New Roman" w:hAnsi="Times New Roman" w:cs="Times New Roman" w:hint="eastAsia"/>
+                <w:lang w:val="en-US"/>
+              </w:rPr>
+              <w:t>mplement train-validation data split</w:t>
+            </w:r>
           </w:p>
         </w:tc>
         <w:tc>
@@ -1455,10 +1817,333 @@
             <w:pPr>
               <w:jc w:val="center"/>
               <w:rPr>
-                <w:rFonts w:ascii="Times New Roman" w:hAnsi="Times New Roman" w:cs="Times New Roman" w:hint="eastAsia"/>
-                <w:lang w:val="en-US"/>
-              </w:rPr>
-            </w:pPr>
+                <w:rFonts w:ascii="Times New Roman" w:hAnsi="Times New Roman" w:cs="Times New Roman"/>
+                <w:lang w:val="en-US"/>
+              </w:rPr>
+            </w:pPr>
+            <w:r>
+              <w:rPr>
+                <w:rFonts w:ascii="Times New Roman" w:hAnsi="Times New Roman" w:cs="Times New Roman" w:hint="eastAsia"/>
+                <w:lang w:val="en-US"/>
+              </w:rPr>
+              <w:t>1</w:t>
+            </w:r>
+          </w:p>
+        </w:tc>
+      </w:tr>
+      <w:tr>
+        <w:trPr>
+          <w:trHeight w:val="309"/>
+        </w:trPr>
+        <w:tc>
+          <w:tcPr>
+            <w:tcW w:w="2122" w:type="dxa"/>
+            <w:vMerge/>
+            <w:vAlign w:val="center"/>
+          </w:tcPr>
+          <w:p>
+            <w:pPr>
+              <w:pStyle w:val="a9"/>
+              <w:numPr>
+                <w:ilvl w:val="0"/>
+                <w:numId w:val="2"/>
+              </w:numPr>
+              <w:rPr>
+                <w:rFonts w:ascii="Times New Roman" w:hAnsi="Times New Roman" w:cs="Times New Roman"/>
+              </w:rPr>
+            </w:pPr>
+          </w:p>
+        </w:tc>
+        <w:tc>
+          <w:tcPr>
+            <w:tcW w:w="6237" w:type="dxa"/>
+            <w:vAlign w:val="center"/>
+          </w:tcPr>
+          <w:p>
+            <w:pPr>
+              <w:rPr>
+                <w:rFonts w:ascii="Times New Roman" w:hAnsi="Times New Roman" w:cs="Times New Roman" w:hint="eastAsia"/>
+                <w:lang w:val="en-US"/>
+              </w:rPr>
+            </w:pPr>
+            <w:r>
+              <w:rPr>
+                <w:rFonts w:ascii="Times New Roman" w:hAnsi="Times New Roman" w:cs="Times New Roman"/>
+                <w:lang w:val="en-US"/>
+              </w:rPr>
+              <w:t>I</w:t>
+            </w:r>
+            <w:r>
+              <w:rPr>
+                <w:rFonts w:ascii="Times New Roman" w:hAnsi="Times New Roman" w:cs="Times New Roman" w:hint="eastAsia"/>
+                <w:lang w:val="en-US"/>
+              </w:rPr>
+              <w:t xml:space="preserve">mplement </w:t>
+            </w:r>
+            <w:bookmarkStart w:id="4" w:name="OLE_LINK6"/>
+            <w:proofErr w:type="spellStart"/>
+            <w:r>
+              <w:rPr>
+                <w:rFonts w:ascii="Times New Roman" w:hAnsi="Times New Roman" w:cs="Times New Roman" w:hint="eastAsia"/>
+                <w:lang w:val="en-US"/>
+              </w:rPr>
+              <w:t>RidgeCV</w:t>
+            </w:r>
+            <w:bookmarkEnd w:id="4"/>
+            <w:proofErr w:type="spellEnd"/>
+            <w:r>
+              <w:rPr>
+                <w:rFonts w:ascii="Times New Roman" w:hAnsi="Times New Roman" w:cs="Times New Roman" w:hint="eastAsia"/>
+                <w:lang w:val="en-US"/>
+              </w:rPr>
+              <w:t xml:space="preserve"> model</w:t>
+            </w:r>
+          </w:p>
+        </w:tc>
+        <w:tc>
+          <w:tcPr>
+            <w:tcW w:w="1690" w:type="dxa"/>
+            <w:vAlign w:val="center"/>
+          </w:tcPr>
+          <w:p>
+            <w:pPr>
+              <w:jc w:val="center"/>
+              <w:rPr>
+                <w:rFonts w:ascii="Times New Roman" w:hAnsi="Times New Roman" w:cs="Times New Roman"/>
+                <w:lang w:val="en-US"/>
+              </w:rPr>
+            </w:pPr>
+            <w:r>
+              <w:rPr>
+                <w:rFonts w:ascii="Times New Roman" w:hAnsi="Times New Roman" w:cs="Times New Roman" w:hint="eastAsia"/>
+                <w:lang w:val="en-US"/>
+              </w:rPr>
+              <w:t>2</w:t>
+            </w:r>
+          </w:p>
+        </w:tc>
+      </w:tr>
+      <w:tr>
+        <w:trPr>
+          <w:trHeight w:val="309"/>
+        </w:trPr>
+        <w:tc>
+          <w:tcPr>
+            <w:tcW w:w="2122" w:type="dxa"/>
+            <w:vMerge/>
+            <w:vAlign w:val="center"/>
+          </w:tcPr>
+          <w:p>
+            <w:pPr>
+              <w:pStyle w:val="a9"/>
+              <w:numPr>
+                <w:ilvl w:val="0"/>
+                <w:numId w:val="2"/>
+              </w:numPr>
+              <w:rPr>
+                <w:rFonts w:ascii="Times New Roman" w:hAnsi="Times New Roman" w:cs="Times New Roman"/>
+              </w:rPr>
+            </w:pPr>
+          </w:p>
+        </w:tc>
+        <w:tc>
+          <w:tcPr>
+            <w:tcW w:w="6237" w:type="dxa"/>
+            <w:vAlign w:val="center"/>
+          </w:tcPr>
+          <w:p>
+            <w:pPr>
+              <w:rPr>
+                <w:rFonts w:ascii="Times New Roman" w:hAnsi="Times New Roman" w:cs="Times New Roman"/>
+                <w:lang w:val="en-US"/>
+              </w:rPr>
+            </w:pPr>
+            <w:r>
+              <w:rPr>
+                <w:rFonts w:ascii="Times New Roman" w:hAnsi="Times New Roman" w:cs="Times New Roman"/>
+                <w:lang w:val="en-US"/>
+              </w:rPr>
+              <w:t>Analyze model performance (</w:t>
+            </w:r>
+            <w:proofErr w:type="spellStart"/>
+            <w:r>
+              <w:rPr>
+                <w:rFonts w:ascii="Times New Roman" w:hAnsi="Times New Roman" w:cs="Times New Roman" w:hint="eastAsia"/>
+                <w:lang w:val="en-US"/>
+              </w:rPr>
+              <w:t>RidgeCV</w:t>
+            </w:r>
+            <w:proofErr w:type="spellEnd"/>
+            <w:r>
+              <w:rPr>
+                <w:rFonts w:ascii="Times New Roman" w:hAnsi="Times New Roman" w:cs="Times New Roman"/>
+                <w:lang w:val="en-US"/>
+              </w:rPr>
+              <w:t>)</w:t>
+            </w:r>
+          </w:p>
+        </w:tc>
+        <w:tc>
+          <w:tcPr>
+            <w:tcW w:w="1690" w:type="dxa"/>
+            <w:vAlign w:val="center"/>
+          </w:tcPr>
+          <w:p>
+            <w:pPr>
+              <w:jc w:val="center"/>
+              <w:rPr>
+                <w:rFonts w:ascii="Times New Roman" w:hAnsi="Times New Roman" w:cs="Times New Roman"/>
+                <w:lang w:val="en-US"/>
+              </w:rPr>
+            </w:pPr>
+            <w:r>
+              <w:rPr>
+                <w:rFonts w:ascii="Times New Roman" w:hAnsi="Times New Roman" w:cs="Times New Roman" w:hint="eastAsia"/>
+                <w:lang w:val="en-US"/>
+              </w:rPr>
+              <w:t>1</w:t>
+            </w:r>
+          </w:p>
+        </w:tc>
+      </w:tr>
+      <w:tr>
+        <w:trPr>
+          <w:trHeight w:val="309"/>
+        </w:trPr>
+        <w:tc>
+          <w:tcPr>
+            <w:tcW w:w="2122" w:type="dxa"/>
+            <w:vMerge/>
+            <w:vAlign w:val="center"/>
+          </w:tcPr>
+          <w:p>
+            <w:pPr>
+              <w:pStyle w:val="a9"/>
+              <w:numPr>
+                <w:ilvl w:val="0"/>
+                <w:numId w:val="2"/>
+              </w:numPr>
+              <w:rPr>
+                <w:rFonts w:ascii="Times New Roman" w:hAnsi="Times New Roman" w:cs="Times New Roman"/>
+              </w:rPr>
+            </w:pPr>
+          </w:p>
+        </w:tc>
+        <w:tc>
+          <w:tcPr>
+            <w:tcW w:w="6237" w:type="dxa"/>
+            <w:vAlign w:val="center"/>
+          </w:tcPr>
+          <w:p>
+            <w:pPr>
+              <w:rPr>
+                <w:rFonts w:ascii="Times New Roman" w:hAnsi="Times New Roman" w:cs="Times New Roman" w:hint="eastAsia"/>
+                <w:lang w:val="en-US"/>
+              </w:rPr>
+            </w:pPr>
+            <w:r>
+              <w:rPr>
+                <w:rFonts w:ascii="Times New Roman" w:hAnsi="Times New Roman" w:cs="Times New Roman" w:hint="eastAsia"/>
+                <w:lang w:val="en-US"/>
+              </w:rPr>
+              <w:t xml:space="preserve">Processing test data set with the feature engineering steps </w:t>
+            </w:r>
+          </w:p>
+        </w:tc>
+        <w:tc>
+          <w:tcPr>
+            <w:tcW w:w="1690" w:type="dxa"/>
+            <w:vAlign w:val="center"/>
+          </w:tcPr>
+          <w:p>
+            <w:pPr>
+              <w:jc w:val="center"/>
+              <w:rPr>
+                <w:rFonts w:ascii="Times New Roman" w:hAnsi="Times New Roman" w:cs="Times New Roman"/>
+                <w:lang w:val="en-US"/>
+              </w:rPr>
+            </w:pPr>
+            <w:r>
+              <w:rPr>
+                <w:rFonts w:ascii="Times New Roman" w:hAnsi="Times New Roman" w:cs="Times New Roman" w:hint="eastAsia"/>
+                <w:lang w:val="en-US"/>
+              </w:rPr>
+              <w:t>2</w:t>
+            </w:r>
+          </w:p>
+        </w:tc>
+      </w:tr>
+      <w:tr>
+        <w:trPr>
+          <w:trHeight w:val="309"/>
+        </w:trPr>
+        <w:tc>
+          <w:tcPr>
+            <w:tcW w:w="2122" w:type="dxa"/>
+            <w:vMerge/>
+            <w:vAlign w:val="center"/>
+          </w:tcPr>
+          <w:p>
+            <w:pPr>
+              <w:pStyle w:val="a9"/>
+              <w:numPr>
+                <w:ilvl w:val="0"/>
+                <w:numId w:val="2"/>
+              </w:numPr>
+              <w:rPr>
+                <w:rFonts w:ascii="Times New Roman" w:hAnsi="Times New Roman" w:cs="Times New Roman"/>
+              </w:rPr>
+            </w:pPr>
+          </w:p>
+        </w:tc>
+        <w:tc>
+          <w:tcPr>
+            <w:tcW w:w="6237" w:type="dxa"/>
+            <w:vAlign w:val="center"/>
+          </w:tcPr>
+          <w:p>
+            <w:pPr>
+              <w:rPr>
+                <w:rFonts w:ascii="Times New Roman" w:hAnsi="Times New Roman" w:cs="Times New Roman" w:hint="eastAsia"/>
+                <w:lang w:val="en-US"/>
+              </w:rPr>
+            </w:pPr>
+            <w:r>
+              <w:rPr>
+                <w:rFonts w:ascii="Times New Roman" w:hAnsi="Times New Roman" w:cs="Times New Roman" w:hint="eastAsia"/>
+                <w:lang w:val="en-US"/>
+              </w:rPr>
+              <w:t xml:space="preserve">Implement the evaluation with clamped </w:t>
+            </w:r>
+            <w:r>
+              <w:rPr>
+                <w:rFonts w:ascii="Times New Roman" w:hAnsi="Times New Roman" w:cs="Times New Roman" w:hint="eastAsia"/>
+                <w:lang w:val="en-US"/>
+              </w:rPr>
+              <w:t>test date set</w:t>
+            </w:r>
+          </w:p>
+        </w:tc>
+        <w:tc>
+          <w:tcPr>
+            <w:tcW w:w="1690" w:type="dxa"/>
+            <w:vAlign w:val="center"/>
+          </w:tcPr>
+          <w:p>
+            <w:pPr>
+              <w:jc w:val="center"/>
+              <w:rPr>
+                <w:rFonts w:ascii="Times New Roman" w:hAnsi="Times New Roman" w:cs="Times New Roman" w:hint="eastAsia"/>
+                <w:lang w:val="en-US"/>
+              </w:rPr>
+            </w:pPr>
+            <w:r>
+              <w:rPr>
+                <w:rFonts w:ascii="Times New Roman" w:hAnsi="Times New Roman" w:cs="Times New Roman" w:hint="eastAsia"/>
+                <w:lang w:val="en-US"/>
+              </w:rPr>
+              <w:t>1</w:t>
+            </w:r>
           </w:p>
         </w:tc>
       </w:tr>
@@ -1479,73 +2164,9 @@
         </w:rPr>
       </w:pPr>
     </w:p>
-    <w:p>
-      <w:pPr>
-        <w:rPr>
-          <w:rFonts w:ascii="Times New Roman" w:hAnsi="Times New Roman" w:cs="Times New Roman"/>
-          <w:lang w:val="en-US"/>
-        </w:rPr>
-      </w:pPr>
-    </w:p>
-    <w:p>
-      <w:pPr>
-        <w:rPr>
-          <w:rFonts w:ascii="Times New Roman" w:hAnsi="Times New Roman" w:cs="Times New Roman"/>
-          <w:lang w:val="en-US"/>
-        </w:rPr>
-      </w:pPr>
-    </w:p>
-    <w:p>
-      <w:pPr>
-        <w:rPr>
-          <w:rFonts w:ascii="Times New Roman" w:hAnsi="Times New Roman" w:cs="Times New Roman"/>
-          <w:lang w:val="en-US"/>
-        </w:rPr>
-      </w:pPr>
-    </w:p>
-    <w:p>
-      <w:pPr>
-        <w:rPr>
-          <w:rFonts w:ascii="Times New Roman" w:hAnsi="Times New Roman" w:cs="Times New Roman"/>
-          <w:lang w:val="en-US"/>
-        </w:rPr>
-      </w:pPr>
-    </w:p>
-    <w:p>
-      <w:pPr>
-        <w:rPr>
-          <w:rFonts w:ascii="Times New Roman" w:hAnsi="Times New Roman" w:cs="Times New Roman"/>
-          <w:lang w:val="en-US"/>
-        </w:rPr>
-      </w:pPr>
-    </w:p>
-    <w:p>
-      <w:pPr>
-        <w:rPr>
-          <w:rFonts w:ascii="Times New Roman" w:hAnsi="Times New Roman" w:cs="Times New Roman"/>
-          <w:lang w:val="en-US"/>
-        </w:rPr>
-      </w:pPr>
-    </w:p>
-    <w:p>
-      <w:pPr>
-        <w:rPr>
-          <w:rFonts w:ascii="Times New Roman" w:hAnsi="Times New Roman" w:cs="Times New Roman"/>
-          <w:lang w:val="en-US"/>
-        </w:rPr>
-      </w:pPr>
-    </w:p>
-    <w:p>
-      <w:pPr>
-        <w:rPr>
-          <w:rFonts w:ascii="Times New Roman" w:hAnsi="Times New Roman" w:cs="Times New Roman"/>
-          <w:lang w:val="en-US"/>
-        </w:rPr>
-      </w:pPr>
-    </w:p>
     <w:tbl>
       <w:tblPr>
-        <w:tblStyle w:val="TableGrid"/>
+        <w:tblStyle w:val="ae"/>
         <w:tblW w:w="10049" w:type="dxa"/>
         <w:tblLook w:val="04A0" w:firstRow="1" w:lastRow="0" w:firstColumn="1" w:lastColumn="0" w:noHBand="0" w:noVBand="1"/>
       </w:tblPr>
@@ -1567,7 +2188,7 @@
           <w:p>
             <w:pPr>
               <w:rPr>
-                <w:rFonts w:ascii="Times New Roman" w:hAnsi="Times New Roman" w:cs="Times New Roman" w:hint="eastAsia"/>
+                <w:rFonts w:ascii="Times New Roman" w:hAnsi="Times New Roman" w:cs="Times New Roman"/>
                 <w:b/>
                 <w:bCs/>
                 <w:lang w:val="en-US"/>
@@ -1608,7 +2229,7 @@
             <w:pPr>
               <w:jc w:val="center"/>
               <w:rPr>
-                <w:rFonts w:ascii="Times New Roman" w:hAnsi="Times New Roman" w:cs="Times New Roman" w:hint="eastAsia"/>
+                <w:rFonts w:ascii="Times New Roman" w:hAnsi="Times New Roman" w:cs="Times New Roman"/>
                 <w:b/>
                 <w:bCs/>
                 <w:lang w:val="en-US"/>
@@ -1635,7 +2256,7 @@
             <w:pPr>
               <w:jc w:val="center"/>
               <w:rPr>
-                <w:rFonts w:ascii="Times New Roman" w:hAnsi="Times New Roman" w:cs="Times New Roman" w:hint="eastAsia"/>
+                <w:rFonts w:ascii="Times New Roman" w:hAnsi="Times New Roman" w:cs="Times New Roman"/>
                 <w:b/>
                 <w:bCs/>
                 <w:lang w:val="en-US"/>
@@ -1662,7 +2283,7 @@
             <w:pPr>
               <w:jc w:val="center"/>
               <w:rPr>
-                <w:rFonts w:ascii="Times New Roman" w:hAnsi="Times New Roman" w:cs="Times New Roman" w:hint="eastAsia"/>
+                <w:rFonts w:ascii="Times New Roman" w:hAnsi="Times New Roman" w:cs="Times New Roman"/>
                 <w:b/>
                 <w:bCs/>
                 <w:lang w:val="en-US"/>
@@ -1700,7 +2321,7 @@
           </w:tcPr>
           <w:p>
             <w:pPr>
-              <w:pStyle w:val="ListParagraph"/>
+              <w:pStyle w:val="a9"/>
               <w:numPr>
                 <w:ilvl w:val="0"/>
                 <w:numId w:val="3"/>
@@ -1726,7 +2347,7 @@
             <w:pPr>
               <w:jc w:val="center"/>
               <w:rPr>
-                <w:rFonts w:ascii="Times New Roman" w:hAnsi="Times New Roman" w:cs="Times New Roman" w:hint="eastAsia"/>
+                <w:rFonts w:ascii="Times New Roman" w:hAnsi="Times New Roman" w:cs="Times New Roman"/>
                 <w:lang w:val="en-US"/>
               </w:rPr>
             </w:pPr>
@@ -1741,7 +2362,7 @@
             <w:pPr>
               <w:jc w:val="center"/>
               <w:rPr>
-                <w:rFonts w:ascii="Times New Roman" w:hAnsi="Times New Roman" w:cs="Times New Roman" w:hint="eastAsia"/>
+                <w:rFonts w:ascii="Times New Roman" w:hAnsi="Times New Roman" w:cs="Times New Roman"/>
                 <w:lang w:val="en-US"/>
               </w:rPr>
             </w:pPr>
@@ -1759,7 +2380,7 @@
           </w:tcPr>
           <w:p>
             <w:pPr>
-              <w:pStyle w:val="ListParagraph"/>
+              <w:pStyle w:val="a9"/>
               <w:numPr>
                 <w:ilvl w:val="0"/>
                 <w:numId w:val="3"/>
@@ -1785,7 +2406,7 @@
             <w:pPr>
               <w:jc w:val="center"/>
               <w:rPr>
-                <w:rFonts w:ascii="Times New Roman" w:hAnsi="Times New Roman" w:cs="Times New Roman" w:hint="eastAsia"/>
+                <w:rFonts w:ascii="Times New Roman" w:hAnsi="Times New Roman" w:cs="Times New Roman"/>
                 <w:lang w:val="en-US"/>
               </w:rPr>
             </w:pPr>
@@ -1800,7 +2421,7 @@
             <w:pPr>
               <w:jc w:val="center"/>
               <w:rPr>
-                <w:rFonts w:ascii="Times New Roman" w:hAnsi="Times New Roman" w:cs="Times New Roman" w:hint="eastAsia"/>
+                <w:rFonts w:ascii="Times New Roman" w:hAnsi="Times New Roman" w:cs="Times New Roman"/>
                 <w:lang w:val="en-US"/>
               </w:rPr>
             </w:pPr>
@@ -1818,7 +2439,7 @@
           </w:tcPr>
           <w:p>
             <w:pPr>
-              <w:pStyle w:val="ListParagraph"/>
+              <w:pStyle w:val="a9"/>
               <w:numPr>
                 <w:ilvl w:val="0"/>
                 <w:numId w:val="3"/>
@@ -1844,7 +2465,7 @@
             <w:pPr>
               <w:jc w:val="center"/>
               <w:rPr>
-                <w:rFonts w:ascii="Times New Roman" w:hAnsi="Times New Roman" w:cs="Times New Roman" w:hint="eastAsia"/>
+                <w:rFonts w:ascii="Times New Roman" w:hAnsi="Times New Roman" w:cs="Times New Roman"/>
                 <w:lang w:val="en-US"/>
               </w:rPr>
             </w:pPr>
@@ -1859,7 +2480,7 @@
             <w:pPr>
               <w:jc w:val="center"/>
               <w:rPr>
-                <w:rFonts w:ascii="Times New Roman" w:hAnsi="Times New Roman" w:cs="Times New Roman" w:hint="eastAsia"/>
+                <w:rFonts w:ascii="Times New Roman" w:hAnsi="Times New Roman" w:cs="Times New Roman"/>
                 <w:lang w:val="en-US"/>
               </w:rPr>
             </w:pPr>
@@ -1877,7 +2498,7 @@
           </w:tcPr>
           <w:p>
             <w:pPr>
-              <w:pStyle w:val="ListParagraph"/>
+              <w:pStyle w:val="a9"/>
               <w:numPr>
                 <w:ilvl w:val="0"/>
                 <w:numId w:val="3"/>
@@ -1903,7 +2524,7 @@
             <w:pPr>
               <w:jc w:val="center"/>
               <w:rPr>
-                <w:rFonts w:ascii="Times New Roman" w:hAnsi="Times New Roman" w:cs="Times New Roman" w:hint="eastAsia"/>
+                <w:rFonts w:ascii="Times New Roman" w:hAnsi="Times New Roman" w:cs="Times New Roman"/>
                 <w:lang w:val="en-US"/>
               </w:rPr>
             </w:pPr>
@@ -1918,7 +2539,7 @@
             <w:pPr>
               <w:jc w:val="center"/>
               <w:rPr>
-                <w:rFonts w:ascii="Times New Roman" w:hAnsi="Times New Roman" w:cs="Times New Roman" w:hint="eastAsia"/>
+                <w:rFonts w:ascii="Times New Roman" w:hAnsi="Times New Roman" w:cs="Times New Roman"/>
                 <w:lang w:val="en-US"/>
               </w:rPr>
             </w:pPr>
@@ -1936,7 +2557,7 @@
           </w:tcPr>
           <w:p>
             <w:pPr>
-              <w:pStyle w:val="ListParagraph"/>
+              <w:pStyle w:val="a9"/>
               <w:numPr>
                 <w:ilvl w:val="0"/>
                 <w:numId w:val="3"/>
@@ -1962,7 +2583,7 @@
             <w:pPr>
               <w:jc w:val="center"/>
               <w:rPr>
-                <w:rFonts w:ascii="Times New Roman" w:hAnsi="Times New Roman" w:cs="Times New Roman" w:hint="eastAsia"/>
+                <w:rFonts w:ascii="Times New Roman" w:hAnsi="Times New Roman" w:cs="Times New Roman"/>
                 <w:lang w:val="en-US"/>
               </w:rPr>
             </w:pPr>
@@ -1977,7 +2598,7 @@
             <w:pPr>
               <w:jc w:val="center"/>
               <w:rPr>
-                <w:rFonts w:ascii="Times New Roman" w:hAnsi="Times New Roman" w:cs="Times New Roman" w:hint="eastAsia"/>
+                <w:rFonts w:ascii="Times New Roman" w:hAnsi="Times New Roman" w:cs="Times New Roman"/>
                 <w:lang w:val="en-US"/>
               </w:rPr>
             </w:pPr>
@@ -2011,7 +2632,7 @@
     </w:p>
     <w:tbl>
       <w:tblPr>
-        <w:tblStyle w:val="TableGrid"/>
+        <w:tblStyle w:val="ae"/>
         <w:tblW w:w="10049" w:type="dxa"/>
         <w:tblLook w:val="04A0" w:firstRow="1" w:lastRow="0" w:firstColumn="1" w:lastColumn="0" w:noHBand="0" w:noVBand="1"/>
       </w:tblPr>
@@ -2033,7 +2654,7 @@
           <w:p>
             <w:pPr>
               <w:rPr>
-                <w:rFonts w:ascii="Times New Roman" w:hAnsi="Times New Roman" w:cs="Times New Roman" w:hint="eastAsia"/>
+                <w:rFonts w:ascii="Times New Roman" w:hAnsi="Times New Roman" w:cs="Times New Roman"/>
                 <w:b/>
                 <w:bCs/>
                 <w:lang w:val="en-US"/>
@@ -2074,7 +2695,7 @@
             <w:pPr>
               <w:jc w:val="center"/>
               <w:rPr>
-                <w:rFonts w:ascii="Times New Roman" w:hAnsi="Times New Roman" w:cs="Times New Roman" w:hint="eastAsia"/>
+                <w:rFonts w:ascii="Times New Roman" w:hAnsi="Times New Roman" w:cs="Times New Roman"/>
                 <w:b/>
                 <w:bCs/>
                 <w:lang w:val="en-US"/>
@@ -2101,7 +2722,7 @@
             <w:pPr>
               <w:jc w:val="center"/>
               <w:rPr>
-                <w:rFonts w:ascii="Times New Roman" w:hAnsi="Times New Roman" w:cs="Times New Roman" w:hint="eastAsia"/>
+                <w:rFonts w:ascii="Times New Roman" w:hAnsi="Times New Roman" w:cs="Times New Roman"/>
                 <w:b/>
                 <w:bCs/>
                 <w:lang w:val="en-US"/>
@@ -2128,7 +2749,7 @@
             <w:pPr>
               <w:jc w:val="center"/>
               <w:rPr>
-                <w:rFonts w:ascii="Times New Roman" w:hAnsi="Times New Roman" w:cs="Times New Roman" w:hint="eastAsia"/>
+                <w:rFonts w:ascii="Times New Roman" w:hAnsi="Times New Roman" w:cs="Times New Roman"/>
                 <w:b/>
                 <w:bCs/>
                 <w:lang w:val="en-US"/>
@@ -2167,7 +2788,7 @@
           </w:tcPr>
           <w:p>
             <w:pPr>
-              <w:pStyle w:val="ListParagraph"/>
+              <w:pStyle w:val="a9"/>
               <w:numPr>
                 <w:ilvl w:val="0"/>
                 <w:numId w:val="4"/>
@@ -2192,7 +2813,7 @@
           <w:p>
             <w:pPr>
               <w:rPr>
-                <w:rFonts w:ascii="Times New Roman" w:hAnsi="Times New Roman" w:cs="Times New Roman" w:hint="eastAsia"/>
+                <w:rFonts w:ascii="Times New Roman" w:hAnsi="Times New Roman" w:cs="Times New Roman"/>
                 <w:lang w:val="en-US"/>
               </w:rPr>
             </w:pPr>
@@ -2214,7 +2835,7 @@
             <w:pPr>
               <w:jc w:val="center"/>
               <w:rPr>
-                <w:rFonts w:ascii="Times New Roman" w:hAnsi="Times New Roman" w:cs="Times New Roman" w:hint="eastAsia"/>
+                <w:rFonts w:ascii="Times New Roman" w:hAnsi="Times New Roman" w:cs="Times New Roman"/>
                 <w:lang w:val="en-US"/>
               </w:rPr>
             </w:pPr>
@@ -2240,7 +2861,7 @@
           </w:tcPr>
           <w:p>
             <w:pPr>
-              <w:pStyle w:val="ListParagraph"/>
+              <w:pStyle w:val="a9"/>
               <w:ind w:left="340"/>
               <w:rPr>
                 <w:rFonts w:ascii="Times New Roman" w:hAnsi="Times New Roman" w:cs="Times New Roman"/>
@@ -2256,7 +2877,7 @@
           <w:p>
             <w:pPr>
               <w:rPr>
-                <w:rFonts w:ascii="Times New Roman" w:hAnsi="Times New Roman" w:cs="Times New Roman" w:hint="eastAsia"/>
+                <w:rFonts w:ascii="Times New Roman" w:hAnsi="Times New Roman" w:cs="Times New Roman"/>
                 <w:lang w:val="en-US"/>
               </w:rPr>
             </w:pPr>
@@ -2278,7 +2899,7 @@
             <w:pPr>
               <w:jc w:val="center"/>
               <w:rPr>
-                <w:rFonts w:ascii="Times New Roman" w:hAnsi="Times New Roman" w:cs="Times New Roman" w:hint="eastAsia"/>
+                <w:rFonts w:ascii="Times New Roman" w:hAnsi="Times New Roman" w:cs="Times New Roman"/>
                 <w:lang w:val="en-US"/>
               </w:rPr>
             </w:pPr>
@@ -2304,7 +2925,7 @@
           </w:tcPr>
           <w:p>
             <w:pPr>
-              <w:pStyle w:val="ListParagraph"/>
+              <w:pStyle w:val="a9"/>
               <w:numPr>
                 <w:ilvl w:val="0"/>
                 <w:numId w:val="4"/>
@@ -2329,7 +2950,7 @@
           <w:p>
             <w:pPr>
               <w:rPr>
-                <w:rFonts w:ascii="Times New Roman" w:hAnsi="Times New Roman" w:cs="Times New Roman" w:hint="eastAsia"/>
+                <w:rFonts w:ascii="Times New Roman" w:hAnsi="Times New Roman" w:cs="Times New Roman"/>
                 <w:lang w:val="en-US"/>
               </w:rPr>
             </w:pPr>
@@ -2351,7 +2972,7 @@
             <w:pPr>
               <w:jc w:val="center"/>
               <w:rPr>
-                <w:rFonts w:ascii="Times New Roman" w:hAnsi="Times New Roman" w:cs="Times New Roman" w:hint="eastAsia"/>
+                <w:rFonts w:ascii="Times New Roman" w:hAnsi="Times New Roman" w:cs="Times New Roman"/>
                 <w:lang w:val="en-US"/>
               </w:rPr>
             </w:pPr>
@@ -2377,7 +2998,7 @@
           </w:tcPr>
           <w:p>
             <w:pPr>
-              <w:pStyle w:val="ListParagraph"/>
+              <w:pStyle w:val="a9"/>
               <w:ind w:left="340"/>
               <w:rPr>
                 <w:rFonts w:ascii="Times New Roman" w:hAnsi="Times New Roman" w:cs="Times New Roman"/>
@@ -2393,7 +3014,7 @@
           <w:p>
             <w:pPr>
               <w:rPr>
-                <w:rFonts w:ascii="Times New Roman" w:hAnsi="Times New Roman" w:cs="Times New Roman" w:hint="eastAsia"/>
+                <w:rFonts w:ascii="Times New Roman" w:hAnsi="Times New Roman" w:cs="Times New Roman"/>
                 <w:lang w:val="en-US"/>
               </w:rPr>
             </w:pPr>
@@ -2415,7 +3036,7 @@
             <w:pPr>
               <w:jc w:val="center"/>
               <w:rPr>
-                <w:rFonts w:ascii="Times New Roman" w:hAnsi="Times New Roman" w:cs="Times New Roman" w:hint="eastAsia"/>
+                <w:rFonts w:ascii="Times New Roman" w:hAnsi="Times New Roman" w:cs="Times New Roman"/>
                 <w:lang w:val="en-US"/>
               </w:rPr>
             </w:pPr>
@@ -2440,7 +3061,7 @@
           </w:tcPr>
           <w:p>
             <w:pPr>
-              <w:pStyle w:val="ListParagraph"/>
+              <w:pStyle w:val="a9"/>
               <w:numPr>
                 <w:ilvl w:val="0"/>
                 <w:numId w:val="4"/>
@@ -2469,6 +3090,20 @@
                 <w:lang w:val="en-US"/>
               </w:rPr>
             </w:pPr>
+            <w:r>
+              <w:rPr>
+                <w:rFonts w:ascii="Times New Roman" w:hAnsi="Times New Roman" w:cs="Times New Roman" w:hint="eastAsia"/>
+                <w:lang w:val="en-US"/>
+              </w:rPr>
+              <w:t>Discuss with group members about</w:t>
+            </w:r>
+            <w:r>
+              <w:rPr>
+                <w:rFonts w:ascii="Times New Roman" w:hAnsi="Times New Roman" w:cs="Times New Roman" w:hint="eastAsia"/>
+                <w:lang w:val="en-US"/>
+              </w:rPr>
+              <w:t xml:space="preserve"> feature pairing result</w:t>
+            </w:r>
           </w:p>
         </w:tc>
         <w:tc>
@@ -2484,6 +3119,13 @@
                 <w:lang w:val="en-US"/>
               </w:rPr>
             </w:pPr>
+            <w:r>
+              <w:rPr>
+                <w:rFonts w:ascii="Times New Roman" w:hAnsi="Times New Roman" w:cs="Times New Roman" w:hint="eastAsia"/>
+                <w:lang w:val="en-US"/>
+              </w:rPr>
+              <w:t>0.5</w:t>
+            </w:r>
           </w:p>
         </w:tc>
       </w:tr>
@@ -2498,7 +3140,7 @@
           </w:tcPr>
           <w:p>
             <w:pPr>
-              <w:pStyle w:val="ListParagraph"/>
+              <w:pStyle w:val="a9"/>
               <w:numPr>
                 <w:ilvl w:val="0"/>
                 <w:numId w:val="4"/>
@@ -2527,6 +3169,20 @@
                 <w:lang w:val="en-US"/>
               </w:rPr>
             </w:pPr>
+            <w:r>
+              <w:rPr>
+                <w:rFonts w:ascii="Times New Roman" w:hAnsi="Times New Roman" w:cs="Times New Roman" w:hint="eastAsia"/>
+                <w:lang w:val="en-US"/>
+              </w:rPr>
+              <w:t>Discuss with group members about</w:t>
+            </w:r>
+            <w:r>
+              <w:rPr>
+                <w:rFonts w:ascii="Times New Roman" w:hAnsi="Times New Roman" w:cs="Times New Roman" w:hint="eastAsia"/>
+                <w:lang w:val="en-US"/>
+              </w:rPr>
+              <w:t xml:space="preserve"> new features</w:t>
+            </w:r>
           </w:p>
         </w:tc>
         <w:tc>
@@ -2542,6 +3198,13 @@
                 <w:lang w:val="en-US"/>
               </w:rPr>
             </w:pPr>
+            <w:r>
+              <w:rPr>
+                <w:rFonts w:ascii="Times New Roman" w:hAnsi="Times New Roman" w:cs="Times New Roman" w:hint="eastAsia"/>
+                <w:lang w:val="en-US"/>
+              </w:rPr>
+              <w:t>0.5</w:t>
+            </w:r>
           </w:p>
         </w:tc>
       </w:tr>
@@ -2557,7 +3220,7 @@
           </w:tcPr>
           <w:p>
             <w:pPr>
-              <w:pStyle w:val="ListParagraph"/>
+              <w:pStyle w:val="a9"/>
               <w:numPr>
                 <w:ilvl w:val="0"/>
                 <w:numId w:val="4"/>
@@ -2582,7 +3245,7 @@
           <w:p>
             <w:pPr>
               <w:rPr>
-                <w:rFonts w:ascii="Times New Roman" w:hAnsi="Times New Roman" w:cs="Times New Roman" w:hint="eastAsia"/>
+                <w:rFonts w:ascii="Times New Roman" w:hAnsi="Times New Roman" w:cs="Times New Roman"/>
                 <w:lang w:val="en-US"/>
               </w:rPr>
             </w:pPr>
@@ -2618,7 +3281,7 @@
             <w:pPr>
               <w:jc w:val="center"/>
               <w:rPr>
-                <w:rFonts w:ascii="Times New Roman" w:hAnsi="Times New Roman" w:cs="Times New Roman" w:hint="eastAsia"/>
+                <w:rFonts w:ascii="Times New Roman" w:hAnsi="Times New Roman" w:cs="Times New Roman"/>
                 <w:lang w:val="en-US"/>
               </w:rPr>
             </w:pPr>
@@ -2644,7 +3307,7 @@
           </w:tcPr>
           <w:p>
             <w:pPr>
-              <w:pStyle w:val="ListParagraph"/>
+              <w:pStyle w:val="a9"/>
               <w:numPr>
                 <w:ilvl w:val="0"/>
                 <w:numId w:val="4"/>
@@ -2663,7 +3326,7 @@
           <w:p>
             <w:pPr>
               <w:rPr>
-                <w:rFonts w:ascii="Times New Roman" w:hAnsi="Times New Roman" w:cs="Times New Roman" w:hint="eastAsia"/>
+                <w:rFonts w:ascii="Times New Roman" w:hAnsi="Times New Roman" w:cs="Times New Roman"/>
                 <w:lang w:val="en-US"/>
               </w:rPr>
             </w:pPr>
@@ -2699,7 +3362,7 @@
             <w:pPr>
               <w:jc w:val="center"/>
               <w:rPr>
-                <w:rFonts w:ascii="Times New Roman" w:hAnsi="Times New Roman" w:cs="Times New Roman" w:hint="eastAsia"/>
+                <w:rFonts w:ascii="Times New Roman" w:hAnsi="Times New Roman" w:cs="Times New Roman"/>
                 <w:lang w:val="en-US"/>
               </w:rPr>
             </w:pPr>
@@ -2725,7 +3388,7 @@
           </w:tcPr>
           <w:p>
             <w:pPr>
-              <w:pStyle w:val="ListParagraph"/>
+              <w:pStyle w:val="a9"/>
               <w:ind w:left="340"/>
               <w:rPr>
                 <w:rFonts w:ascii="Times New Roman" w:hAnsi="Times New Roman" w:cs="Times New Roman"/>
@@ -2741,30 +3404,16 @@
           <w:p>
             <w:pPr>
               <w:rPr>
-                <w:rFonts w:ascii="Times New Roman" w:hAnsi="Times New Roman" w:cs="Times New Roman" w:hint="eastAsia"/>
-                <w:lang w:val="en-US"/>
-              </w:rPr>
-            </w:pPr>
-            <w:r>
-              <w:rPr>
-                <w:rFonts w:ascii="Times New Roman" w:hAnsi="Times New Roman" w:cs="Times New Roman"/>
-                <w:lang w:val="en-US"/>
-              </w:rPr>
-              <w:t xml:space="preserve">Design and implement the </w:t>
-            </w:r>
-            <w:r>
-              <w:rPr>
-                <w:rFonts w:ascii="Times New Roman" w:hAnsi="Times New Roman" w:cs="Times New Roman"/>
-                <w:lang w:val="en-US"/>
-              </w:rPr>
-              <w:t>Lasso</w:t>
-            </w:r>
-            <w:r>
-              <w:rPr>
-                <w:rFonts w:ascii="Times New Roman" w:hAnsi="Times New Roman" w:cs="Times New Roman"/>
-                <w:lang w:val="en-US"/>
-              </w:rPr>
-              <w:t xml:space="preserve"> model</w:t>
+                <w:rFonts w:ascii="Times New Roman" w:hAnsi="Times New Roman" w:cs="Times New Roman"/>
+                <w:lang w:val="en-US"/>
+              </w:rPr>
+            </w:pPr>
+            <w:r>
+              <w:rPr>
+                <w:rFonts w:ascii="Times New Roman" w:hAnsi="Times New Roman" w:cs="Times New Roman"/>
+                <w:lang w:val="en-US"/>
+              </w:rPr>
+              <w:t>Design and implement the Lasso model</w:t>
             </w:r>
           </w:p>
         </w:tc>
@@ -2777,7 +3426,7 @@
             <w:pPr>
               <w:jc w:val="center"/>
               <w:rPr>
-                <w:rFonts w:ascii="Times New Roman" w:hAnsi="Times New Roman" w:cs="Times New Roman" w:hint="eastAsia"/>
+                <w:rFonts w:ascii="Times New Roman" w:hAnsi="Times New Roman" w:cs="Times New Roman"/>
                 <w:lang w:val="en-US"/>
               </w:rPr>
             </w:pPr>
@@ -2803,7 +3452,7 @@
           </w:tcPr>
           <w:p>
             <w:pPr>
-              <w:pStyle w:val="ListParagraph"/>
+              <w:pStyle w:val="a9"/>
               <w:ind w:left="340"/>
               <w:rPr>
                 <w:rFonts w:ascii="Times New Roman" w:hAnsi="Times New Roman" w:cs="Times New Roman"/>
@@ -2819,30 +3468,16 @@
           <w:p>
             <w:pPr>
               <w:rPr>
-                <w:rFonts w:ascii="Times New Roman" w:hAnsi="Times New Roman" w:cs="Times New Roman" w:hint="eastAsia"/>
-                <w:lang w:val="en-US"/>
-              </w:rPr>
-            </w:pPr>
-            <w:r>
-              <w:rPr>
-                <w:rFonts w:ascii="Times New Roman" w:hAnsi="Times New Roman" w:cs="Times New Roman"/>
-                <w:lang w:val="en-US"/>
-              </w:rPr>
-              <w:t>Analyze model performance (</w:t>
-            </w:r>
-            <w:r>
-              <w:rPr>
-                <w:rFonts w:ascii="Times New Roman" w:hAnsi="Times New Roman" w:cs="Times New Roman"/>
-                <w:lang w:val="en-US"/>
-              </w:rPr>
-              <w:t>Lasso</w:t>
-            </w:r>
-            <w:r>
-              <w:rPr>
-                <w:rFonts w:ascii="Times New Roman" w:hAnsi="Times New Roman" w:cs="Times New Roman"/>
-                <w:lang w:val="en-US"/>
-              </w:rPr>
-              <w:t>)</w:t>
+                <w:rFonts w:ascii="Times New Roman" w:hAnsi="Times New Roman" w:cs="Times New Roman"/>
+                <w:lang w:val="en-US"/>
+              </w:rPr>
+            </w:pPr>
+            <w:r>
+              <w:rPr>
+                <w:rFonts w:ascii="Times New Roman" w:hAnsi="Times New Roman" w:cs="Times New Roman"/>
+                <w:lang w:val="en-US"/>
+              </w:rPr>
+              <w:t>Analyze model performance (Lasso)</w:t>
             </w:r>
           </w:p>
         </w:tc>
@@ -2855,7 +3490,7 @@
             <w:pPr>
               <w:jc w:val="center"/>
               <w:rPr>
-                <w:rFonts w:ascii="Times New Roman" w:hAnsi="Times New Roman" w:cs="Times New Roman" w:hint="eastAsia"/>
+                <w:rFonts w:ascii="Times New Roman" w:hAnsi="Times New Roman" w:cs="Times New Roman"/>
                 <w:lang w:val="en-US"/>
               </w:rPr>
             </w:pPr>
@@ -3033,7 +3668,7 @@
     <w:p>
       <w:pPr>
         <w:rPr>
-          <w:rFonts w:ascii="Times New Roman" w:hAnsi="Times New Roman" w:cs="Times New Roman" w:hint="eastAsia"/>
+          <w:rFonts w:ascii="Times New Roman" w:hAnsi="Times New Roman" w:cs="Times New Roman"/>
           <w:lang w:val="en-US"/>
         </w:rPr>
       </w:pPr>
@@ -3430,7 +4065,7 @@
         <w:kern w:val="2"/>
         <w:sz w:val="24"/>
         <w:szCs w:val="24"/>
-        <w:lang w:val="en-CN" w:eastAsia="zh-CN" w:bidi="ar-SA"/>
+        <w:lang w:eastAsia="zh-CN" w:bidi="ar-SA"/>
         <w14:ligatures w14:val="standardContextual"/>
       </w:rPr>
     </w:rPrDefault>
@@ -3814,18 +4449,18 @@
     <w:lsdException w:name="Unresolved Mention" w:semiHidden="1" w:unhideWhenUsed="1"/>
     <w:lsdException w:name="Smart Link" w:semiHidden="1" w:unhideWhenUsed="1"/>
   </w:latentStyles>
-  <w:style w:type="paragraph" w:default="1" w:styleId="Normal">
+  <w:style w:type="paragraph" w:default="1" w:styleId="a">
     <w:name w:val="Normal"/>
     <w:qFormat/>
     <w:rPr>
       <w:lang w:val="en-GB"/>
     </w:rPr>
   </w:style>
-  <w:style w:type="paragraph" w:styleId="Heading1">
+  <w:style w:type="paragraph" w:styleId="1">
     <w:name w:val="heading 1"/>
-    <w:basedOn w:val="Normal"/>
-    <w:next w:val="Normal"/>
-    <w:link w:val="Heading1Char"/>
+    <w:basedOn w:val="a"/>
+    <w:next w:val="a"/>
+    <w:link w:val="10"/>
     <w:uiPriority w:val="9"/>
     <w:qFormat/>
     <w:rsid w:val="009E35E6"/>
@@ -3842,11 +4477,11 @@
       <w:szCs w:val="40"/>
     </w:rPr>
   </w:style>
-  <w:style w:type="paragraph" w:styleId="Heading2">
+  <w:style w:type="paragraph" w:styleId="2">
     <w:name w:val="heading 2"/>
-    <w:basedOn w:val="Normal"/>
-    <w:next w:val="Normal"/>
-    <w:link w:val="Heading2Char"/>
+    <w:basedOn w:val="a"/>
+    <w:next w:val="a"/>
+    <w:link w:val="20"/>
     <w:uiPriority w:val="9"/>
     <w:semiHidden/>
     <w:unhideWhenUsed/>
@@ -3865,11 +4500,11 @@
       <w:szCs w:val="32"/>
     </w:rPr>
   </w:style>
-  <w:style w:type="paragraph" w:styleId="Heading3">
+  <w:style w:type="paragraph" w:styleId="3">
     <w:name w:val="heading 3"/>
-    <w:basedOn w:val="Normal"/>
-    <w:next w:val="Normal"/>
-    <w:link w:val="Heading3Char"/>
+    <w:basedOn w:val="a"/>
+    <w:next w:val="a"/>
+    <w:link w:val="30"/>
     <w:uiPriority w:val="9"/>
     <w:semiHidden/>
     <w:unhideWhenUsed/>
@@ -3888,11 +4523,11 @@
       <w:szCs w:val="28"/>
     </w:rPr>
   </w:style>
-  <w:style w:type="paragraph" w:styleId="Heading4">
+  <w:style w:type="paragraph" w:styleId="4">
     <w:name w:val="heading 4"/>
-    <w:basedOn w:val="Normal"/>
-    <w:next w:val="Normal"/>
-    <w:link w:val="Heading4Char"/>
+    <w:basedOn w:val="a"/>
+    <w:next w:val="a"/>
+    <w:link w:val="40"/>
     <w:uiPriority w:val="9"/>
     <w:semiHidden/>
     <w:unhideWhenUsed/>
@@ -3911,11 +4546,11 @@
       <w:color w:val="2F5496" w:themeColor="accent1" w:themeShade="BF"/>
     </w:rPr>
   </w:style>
-  <w:style w:type="paragraph" w:styleId="Heading5">
+  <w:style w:type="paragraph" w:styleId="5">
     <w:name w:val="heading 5"/>
-    <w:basedOn w:val="Normal"/>
-    <w:next w:val="Normal"/>
-    <w:link w:val="Heading5Char"/>
+    <w:basedOn w:val="a"/>
+    <w:next w:val="a"/>
+    <w:link w:val="50"/>
     <w:uiPriority w:val="9"/>
     <w:semiHidden/>
     <w:unhideWhenUsed/>
@@ -3932,11 +4567,11 @@
       <w:color w:val="2F5496" w:themeColor="accent1" w:themeShade="BF"/>
     </w:rPr>
   </w:style>
-  <w:style w:type="paragraph" w:styleId="Heading6">
+  <w:style w:type="paragraph" w:styleId="6">
     <w:name w:val="heading 6"/>
-    <w:basedOn w:val="Normal"/>
-    <w:next w:val="Normal"/>
-    <w:link w:val="Heading6Char"/>
+    <w:basedOn w:val="a"/>
+    <w:next w:val="a"/>
+    <w:link w:val="60"/>
     <w:uiPriority w:val="9"/>
     <w:semiHidden/>
     <w:unhideWhenUsed/>
@@ -3955,11 +4590,11 @@
       <w:color w:val="595959" w:themeColor="text1" w:themeTint="A6"/>
     </w:rPr>
   </w:style>
-  <w:style w:type="paragraph" w:styleId="Heading7">
+  <w:style w:type="paragraph" w:styleId="7">
     <w:name w:val="heading 7"/>
-    <w:basedOn w:val="Normal"/>
-    <w:next w:val="Normal"/>
-    <w:link w:val="Heading7Char"/>
+    <w:basedOn w:val="a"/>
+    <w:next w:val="a"/>
+    <w:link w:val="70"/>
     <w:uiPriority w:val="9"/>
     <w:semiHidden/>
     <w:unhideWhenUsed/>
@@ -3976,11 +4611,11 @@
       <w:color w:val="595959" w:themeColor="text1" w:themeTint="A6"/>
     </w:rPr>
   </w:style>
-  <w:style w:type="paragraph" w:styleId="Heading8">
+  <w:style w:type="paragraph" w:styleId="8">
     <w:name w:val="heading 8"/>
-    <w:basedOn w:val="Normal"/>
-    <w:next w:val="Normal"/>
-    <w:link w:val="Heading8Char"/>
+    <w:basedOn w:val="a"/>
+    <w:next w:val="a"/>
+    <w:link w:val="80"/>
     <w:uiPriority w:val="9"/>
     <w:semiHidden/>
     <w:unhideWhenUsed/>
@@ -3998,11 +4633,11 @@
       <w:color w:val="272727" w:themeColor="text1" w:themeTint="D8"/>
     </w:rPr>
   </w:style>
-  <w:style w:type="paragraph" w:styleId="Heading9">
+  <w:style w:type="paragraph" w:styleId="9">
     <w:name w:val="heading 9"/>
-    <w:basedOn w:val="Normal"/>
-    <w:next w:val="Normal"/>
-    <w:link w:val="Heading9Char"/>
+    <w:basedOn w:val="a"/>
+    <w:next w:val="a"/>
+    <w:link w:val="90"/>
     <w:uiPriority w:val="9"/>
     <w:semiHidden/>
     <w:unhideWhenUsed/>
@@ -4018,13 +4653,12 @@
       <w:color w:val="272727" w:themeColor="text1" w:themeTint="D8"/>
     </w:rPr>
   </w:style>
-  <w:style w:type="character" w:default="1" w:styleId="DefaultParagraphFont">
+  <w:style w:type="character" w:default="1" w:styleId="a0">
     <w:name w:val="Default Paragraph Font"/>
     <w:uiPriority w:val="1"/>
-    <w:semiHidden/>
     <w:unhideWhenUsed/>
   </w:style>
-  <w:style w:type="table" w:default="1" w:styleId="TableNormal">
+  <w:style w:type="table" w:default="1" w:styleId="a1">
     <w:name w:val="Normal Table"/>
     <w:uiPriority w:val="99"/>
     <w:semiHidden/>
@@ -4039,16 +4673,16 @@
       </w:tblCellMar>
     </w:tblPr>
   </w:style>
-  <w:style w:type="numbering" w:default="1" w:styleId="NoList">
+  <w:style w:type="numbering" w:default="1" w:styleId="a2">
     <w:name w:val="No List"/>
     <w:uiPriority w:val="99"/>
     <w:semiHidden/>
     <w:unhideWhenUsed/>
   </w:style>
-  <w:style w:type="character" w:customStyle="1" w:styleId="Heading1Char">
-    <w:name w:val="Heading 1 Char"/>
-    <w:basedOn w:val="DefaultParagraphFont"/>
-    <w:link w:val="Heading1"/>
+  <w:style w:type="character" w:customStyle="1" w:styleId="10">
+    <w:name w:val="标题 1 字符"/>
+    <w:basedOn w:val="a0"/>
+    <w:link w:val="1"/>
     <w:uiPriority w:val="9"/>
     <w:rsid w:val="009E35E6"/>
     <w:rPr>
@@ -4059,10 +4693,10 @@
       <w:lang w:val="en-GB"/>
     </w:rPr>
   </w:style>
-  <w:style w:type="character" w:customStyle="1" w:styleId="Heading2Char">
-    <w:name w:val="Heading 2 Char"/>
-    <w:basedOn w:val="DefaultParagraphFont"/>
-    <w:link w:val="Heading2"/>
+  <w:style w:type="character" w:customStyle="1" w:styleId="20">
+    <w:name w:val="标题 2 字符"/>
+    <w:basedOn w:val="a0"/>
+    <w:link w:val="2"/>
     <w:uiPriority w:val="9"/>
     <w:semiHidden/>
     <w:rsid w:val="009E35E6"/>
@@ -4074,10 +4708,10 @@
       <w:lang w:val="en-GB"/>
     </w:rPr>
   </w:style>
-  <w:style w:type="character" w:customStyle="1" w:styleId="Heading3Char">
-    <w:name w:val="Heading 3 Char"/>
-    <w:basedOn w:val="DefaultParagraphFont"/>
-    <w:link w:val="Heading3"/>
+  <w:style w:type="character" w:customStyle="1" w:styleId="30">
+    <w:name w:val="标题 3 字符"/>
+    <w:basedOn w:val="a0"/>
+    <w:link w:val="3"/>
     <w:uiPriority w:val="9"/>
     <w:semiHidden/>
     <w:rsid w:val="009E35E6"/>
@@ -4089,10 +4723,10 @@
       <w:lang w:val="en-GB"/>
     </w:rPr>
   </w:style>
-  <w:style w:type="character" w:customStyle="1" w:styleId="Heading4Char">
-    <w:name w:val="Heading 4 Char"/>
-    <w:basedOn w:val="DefaultParagraphFont"/>
-    <w:link w:val="Heading4"/>
+  <w:style w:type="character" w:customStyle="1" w:styleId="40">
+    <w:name w:val="标题 4 字符"/>
+    <w:basedOn w:val="a0"/>
+    <w:link w:val="4"/>
     <w:uiPriority w:val="9"/>
     <w:semiHidden/>
     <w:rsid w:val="009E35E6"/>
@@ -4104,10 +4738,10 @@
       <w:lang w:val="en-GB"/>
     </w:rPr>
   </w:style>
-  <w:style w:type="character" w:customStyle="1" w:styleId="Heading5Char">
-    <w:name w:val="Heading 5 Char"/>
-    <w:basedOn w:val="DefaultParagraphFont"/>
-    <w:link w:val="Heading5"/>
+  <w:style w:type="character" w:customStyle="1" w:styleId="50">
+    <w:name w:val="标题 5 字符"/>
+    <w:basedOn w:val="a0"/>
+    <w:link w:val="5"/>
     <w:uiPriority w:val="9"/>
     <w:semiHidden/>
     <w:rsid w:val="009E35E6"/>
@@ -4117,10 +4751,10 @@
       <w:lang w:val="en-GB"/>
     </w:rPr>
   </w:style>
-  <w:style w:type="character" w:customStyle="1" w:styleId="Heading6Char">
-    <w:name w:val="Heading 6 Char"/>
-    <w:basedOn w:val="DefaultParagraphFont"/>
-    <w:link w:val="Heading6"/>
+  <w:style w:type="character" w:customStyle="1" w:styleId="60">
+    <w:name w:val="标题 6 字符"/>
+    <w:basedOn w:val="a0"/>
+    <w:link w:val="6"/>
     <w:uiPriority w:val="9"/>
     <w:semiHidden/>
     <w:rsid w:val="009E35E6"/>
@@ -4132,10 +4766,10 @@
       <w:lang w:val="en-GB"/>
     </w:rPr>
   </w:style>
-  <w:style w:type="character" w:customStyle="1" w:styleId="Heading7Char">
-    <w:name w:val="Heading 7 Char"/>
-    <w:basedOn w:val="DefaultParagraphFont"/>
-    <w:link w:val="Heading7"/>
+  <w:style w:type="character" w:customStyle="1" w:styleId="70">
+    <w:name w:val="标题 7 字符"/>
+    <w:basedOn w:val="a0"/>
+    <w:link w:val="7"/>
     <w:uiPriority w:val="9"/>
     <w:semiHidden/>
     <w:rsid w:val="009E35E6"/>
@@ -4145,10 +4779,10 @@
       <w:lang w:val="en-GB"/>
     </w:rPr>
   </w:style>
-  <w:style w:type="character" w:customStyle="1" w:styleId="Heading8Char">
-    <w:name w:val="Heading 8 Char"/>
-    <w:basedOn w:val="DefaultParagraphFont"/>
-    <w:link w:val="Heading8"/>
+  <w:style w:type="character" w:customStyle="1" w:styleId="80">
+    <w:name w:val="标题 8 字符"/>
+    <w:basedOn w:val="a0"/>
+    <w:link w:val="8"/>
     <w:uiPriority w:val="9"/>
     <w:semiHidden/>
     <w:rsid w:val="009E35E6"/>
@@ -4160,10 +4794,10 @@
       <w:lang w:val="en-GB"/>
     </w:rPr>
   </w:style>
-  <w:style w:type="character" w:customStyle="1" w:styleId="Heading9Char">
-    <w:name w:val="Heading 9 Char"/>
-    <w:basedOn w:val="DefaultParagraphFont"/>
-    <w:link w:val="Heading9"/>
+  <w:style w:type="character" w:customStyle="1" w:styleId="90">
+    <w:name w:val="标题 9 字符"/>
+    <w:basedOn w:val="a0"/>
+    <w:link w:val="9"/>
     <w:uiPriority w:val="9"/>
     <w:semiHidden/>
     <w:rsid w:val="009E35E6"/>
@@ -4173,11 +4807,11 @@
       <w:lang w:val="en-GB"/>
     </w:rPr>
   </w:style>
-  <w:style w:type="paragraph" w:styleId="Title">
+  <w:style w:type="paragraph" w:styleId="a3">
     <w:name w:val="Title"/>
-    <w:basedOn w:val="Normal"/>
-    <w:next w:val="Normal"/>
-    <w:link w:val="TitleChar"/>
+    <w:basedOn w:val="a"/>
+    <w:next w:val="a"/>
+    <w:link w:val="a4"/>
     <w:uiPriority w:val="10"/>
     <w:qFormat/>
     <w:rsid w:val="009E35E6"/>
@@ -4193,10 +4827,10 @@
       <w:szCs w:val="56"/>
     </w:rPr>
   </w:style>
-  <w:style w:type="character" w:customStyle="1" w:styleId="TitleChar">
-    <w:name w:val="Title Char"/>
-    <w:basedOn w:val="DefaultParagraphFont"/>
-    <w:link w:val="Title"/>
+  <w:style w:type="character" w:customStyle="1" w:styleId="a4">
+    <w:name w:val="标题 字符"/>
+    <w:basedOn w:val="a0"/>
+    <w:link w:val="a3"/>
     <w:uiPriority w:val="10"/>
     <w:rsid w:val="009E35E6"/>
     <w:rPr>
@@ -4208,11 +4842,11 @@
       <w:lang w:val="en-GB"/>
     </w:rPr>
   </w:style>
-  <w:style w:type="paragraph" w:styleId="Subtitle">
+  <w:style w:type="paragraph" w:styleId="a5">
     <w:name w:val="Subtitle"/>
-    <w:basedOn w:val="Normal"/>
-    <w:next w:val="Normal"/>
-    <w:link w:val="SubtitleChar"/>
+    <w:basedOn w:val="a"/>
+    <w:next w:val="a"/>
+    <w:link w:val="a6"/>
     <w:uiPriority w:val="11"/>
     <w:qFormat/>
     <w:rsid w:val="009E35E6"/>
@@ -4230,10 +4864,10 @@
       <w:szCs w:val="28"/>
     </w:rPr>
   </w:style>
-  <w:style w:type="character" w:customStyle="1" w:styleId="SubtitleChar">
-    <w:name w:val="Subtitle Char"/>
-    <w:basedOn w:val="DefaultParagraphFont"/>
-    <w:link w:val="Subtitle"/>
+  <w:style w:type="character" w:customStyle="1" w:styleId="a6">
+    <w:name w:val="副标题 字符"/>
+    <w:basedOn w:val="a0"/>
+    <w:link w:val="a5"/>
     <w:uiPriority w:val="11"/>
     <w:rsid w:val="009E35E6"/>
     <w:rPr>
@@ -4245,11 +4879,11 @@
       <w:lang w:val="en-GB"/>
     </w:rPr>
   </w:style>
-  <w:style w:type="paragraph" w:styleId="Quote">
+  <w:style w:type="paragraph" w:styleId="a7">
     <w:name w:val="Quote"/>
-    <w:basedOn w:val="Normal"/>
-    <w:next w:val="Normal"/>
-    <w:link w:val="QuoteChar"/>
+    <w:basedOn w:val="a"/>
+    <w:next w:val="a"/>
+    <w:link w:val="a8"/>
     <w:uiPriority w:val="29"/>
     <w:qFormat/>
     <w:rsid w:val="009E35E6"/>
@@ -4263,10 +4897,10 @@
       <w:color w:val="404040" w:themeColor="text1" w:themeTint="BF"/>
     </w:rPr>
   </w:style>
-  <w:style w:type="character" w:customStyle="1" w:styleId="QuoteChar">
-    <w:name w:val="Quote Char"/>
-    <w:basedOn w:val="DefaultParagraphFont"/>
-    <w:link w:val="Quote"/>
+  <w:style w:type="character" w:customStyle="1" w:styleId="a8">
+    <w:name w:val="引用 字符"/>
+    <w:basedOn w:val="a0"/>
+    <w:link w:val="a7"/>
     <w:uiPriority w:val="29"/>
     <w:rsid w:val="009E35E6"/>
     <w:rPr>
@@ -4276,9 +4910,9 @@
       <w:lang w:val="en-GB"/>
     </w:rPr>
   </w:style>
-  <w:style w:type="paragraph" w:styleId="ListParagraph">
+  <w:style w:type="paragraph" w:styleId="a9">
     <w:name w:val="List Paragraph"/>
-    <w:basedOn w:val="Normal"/>
+    <w:basedOn w:val="a"/>
     <w:uiPriority w:val="34"/>
     <w:qFormat/>
     <w:rsid w:val="009E35E6"/>
@@ -4287,9 +4921,9 @@
       <w:contextualSpacing/>
     </w:pPr>
   </w:style>
-  <w:style w:type="character" w:styleId="IntenseEmphasis">
+  <w:style w:type="character" w:styleId="aa">
     <w:name w:val="Intense Emphasis"/>
-    <w:basedOn w:val="DefaultParagraphFont"/>
+    <w:basedOn w:val="a0"/>
     <w:uiPriority w:val="21"/>
     <w:qFormat/>
     <w:rsid w:val="009E35E6"/>
@@ -4299,11 +4933,11 @@
       <w:color w:val="2F5496" w:themeColor="accent1" w:themeShade="BF"/>
     </w:rPr>
   </w:style>
-  <w:style w:type="paragraph" w:styleId="IntenseQuote">
+  <w:style w:type="paragraph" w:styleId="ab">
     <w:name w:val="Intense Quote"/>
-    <w:basedOn w:val="Normal"/>
-    <w:next w:val="Normal"/>
-    <w:link w:val="IntenseQuoteChar"/>
+    <w:basedOn w:val="a"/>
+    <w:next w:val="a"/>
+    <w:link w:val="ac"/>
     <w:uiPriority w:val="30"/>
     <w:qFormat/>
     <w:rsid w:val="009E35E6"/>
@@ -4322,10 +4956,10 @@
       <w:color w:val="2F5496" w:themeColor="accent1" w:themeShade="BF"/>
     </w:rPr>
   </w:style>
-  <w:style w:type="character" w:customStyle="1" w:styleId="IntenseQuoteChar">
-    <w:name w:val="Intense Quote Char"/>
-    <w:basedOn w:val="DefaultParagraphFont"/>
-    <w:link w:val="IntenseQuote"/>
+  <w:style w:type="character" w:customStyle="1" w:styleId="ac">
+    <w:name w:val="明显引用 字符"/>
+    <w:basedOn w:val="a0"/>
+    <w:link w:val="ab"/>
     <w:uiPriority w:val="30"/>
     <w:rsid w:val="009E35E6"/>
     <w:rPr>
@@ -4335,9 +4969,9 @@
       <w:lang w:val="en-GB"/>
     </w:rPr>
   </w:style>
-  <w:style w:type="character" w:styleId="IntenseReference">
+  <w:style w:type="character" w:styleId="ad">
     <w:name w:val="Intense Reference"/>
-    <w:basedOn w:val="DefaultParagraphFont"/>
+    <w:basedOn w:val="a0"/>
     <w:uiPriority w:val="32"/>
     <w:qFormat/>
     <w:rsid w:val="009E35E6"/>
@@ -4349,9 +4983,9 @@
       <w:spacing w:val="5"/>
     </w:rPr>
   </w:style>
-  <w:style w:type="table" w:styleId="TableGrid">
+  <w:style w:type="table" w:styleId="ae">
     <w:name w:val="Table Grid"/>
-    <w:basedOn w:val="TableNormal"/>
+    <w:basedOn w:val="a1"/>
     <w:uiPriority w:val="39"/>
     <w:rsid w:val="00055995"/>
     <w:tblPr>

</xml_diff>